<commit_message>
Update Avaliacao01_UML.docx with new content
</commit_message>
<xml_diff>
--- a/Avaliacao01_UML.docx
+++ b/Avaliacao01_UML.docx
@@ -61,20 +61,27 @@
         <w:pBdr/>
         <w:spacing w:after="80" w:before="240"/>
         <w:ind/>
-        <w:rPr/>
+        <w:jc w:val="center"/>
+        <w:rPr>
+          <w:color w:val="000000" w:themeColor="text1"/>
+        </w:rPr>
       </w:pPr>
       <w:r>
         <w:rPr>
           <w:rFonts w:ascii="Arial" w:hAnsi="Arial" w:eastAsia="Arial" w:cs="Arial"/>
           <w:b/>
           <w:bCs/>
-          <w:color w:val="1a237e"/>
+          <w:color w:val="000000" w:themeColor="text1"/>
           <w:sz w:val="36"/>
           <w:szCs w:val="36"/>
         </w:rPr>
         <w:t xml:space="preserve">Avaliação 01 – Modelagem UML e Implementação de Classes</w:t>
       </w:r>
-      <w:r/>
+      <w:r>
+        <w:rPr>
+          <w:color w:val="000000" w:themeColor="text1"/>
+        </w:rPr>
+      </w:r>
     </w:p>
     <w:p>
       <w:pPr>
@@ -348,6 +355,116 @@
         </w:tc>
       </w:tr>
     </w:tbl>
+    <w:tbl>
+      <w:tblPr>
+        <w:tblW w:w="9360" w:type="dxa"/>
+        <w:tblBorders>
+          <w:top w:val="single" w:color="cccccc" w:sz="1" w:space="0"/>
+          <w:left w:val="single" w:color="cccccc" w:sz="1" w:space="0"/>
+          <w:bottom w:val="single" w:color="cccccc" w:sz="1" w:space="0"/>
+          <w:right w:val="single" w:color="cccccc" w:sz="1" w:space="0"/>
+          <w:insideH w:val="single" w:color="000000" w:sz="4" w:space="0"/>
+          <w:insideV w:val="single" w:color="000000" w:sz="4" w:space="0"/>
+        </w:tblBorders>
+        <w:tblLook w:val="04A0" w:firstRow="1" w:lastRow="0" w:firstColumn="1" w:lastColumn="0" w:noHBand="0" w:noVBand="1"/>
+      </w:tblPr>
+      <w:tblGrid>
+        <w:gridCol w:w="2500"/>
+        <w:gridCol w:w="6860"/>
+      </w:tblGrid>
+      <w:tr>
+        <w:trPr/>
+        <w:tc>
+          <w:tcPr>
+            <w:shd w:val="clear" w:color="ffffff" w:fill="e8f0fe"/>
+            <w:tcBorders>
+              <w:top w:val="single" w:color="cccccc" w:sz="1" w:space="0"/>
+              <w:left w:val="single" w:color="cccccc" w:sz="1" w:space="0"/>
+              <w:bottom w:val="single" w:color="cccccc" w:sz="1" w:space="0"/>
+              <w:right w:val="single" w:color="cccccc" w:sz="1" w:space="0"/>
+            </w:tcBorders>
+            <w:tcMar>
+              <w:left w:w="120" w:type="dxa"/>
+              <w:top w:w="80" w:type="dxa"/>
+              <w:right w:w="120" w:type="dxa"/>
+              <w:bottom w:w="80" w:type="dxa"/>
+            </w:tcMar>
+            <w:tcW w:w="2500" w:type="dxa"/>
+          </w:tcPr>
+          <w:p>
+            <w:pPr>
+              <w:pBdr/>
+              <w:spacing/>
+              <w:ind/>
+              <w:rPr/>
+            </w:pPr>
+            <w:r>
+              <w:rPr>
+                <w:rFonts w:ascii="Arial" w:hAnsi="Arial" w:eastAsia="Arial" w:cs="Arial"/>
+                <w:b/>
+                <w:bCs/>
+                <w:sz w:val="22"/>
+                <w:szCs w:val="22"/>
+                <w:lang w:val="pt-BR"/>
+              </w:rPr>
+              <w:t xml:space="preserve">Repositorio Github</w:t>
+            </w:r>
+            <w:r/>
+          </w:p>
+        </w:tc>
+        <w:tc>
+          <w:tcPr>
+            <w:tcBorders>
+              <w:top w:val="single" w:color="cccccc" w:sz="1" w:space="0"/>
+              <w:left w:val="single" w:color="cccccc" w:sz="1" w:space="0"/>
+              <w:bottom w:val="single" w:color="cccccc" w:sz="1" w:space="0"/>
+              <w:right w:val="single" w:color="cccccc" w:sz="1" w:space="0"/>
+            </w:tcBorders>
+            <w:tcMar>
+              <w:left w:w="120" w:type="dxa"/>
+              <w:top w:w="80" w:type="dxa"/>
+              <w:right w:w="120" w:type="dxa"/>
+              <w:bottom w:w="80" w:type="dxa"/>
+            </w:tcMar>
+            <w:tcW w:w="6860" w:type="dxa"/>
+          </w:tcPr>
+          <w:p>
+            <w:pPr>
+              <w:pBdr/>
+              <w:tabs>
+                <w:tab w:val="left" w:leader="none" w:pos="1627"/>
+              </w:tabs>
+              <w:spacing/>
+              <w:ind/>
+              <w:rPr/>
+            </w:pPr>
+            <w:r>
+              <w:rPr>
+                <w:rFonts w:ascii="Arial" w:hAnsi="Arial" w:eastAsia="Arial" w:cs="Arial"/>
+                <w:sz w:val="22"/>
+                <w:szCs w:val="22"/>
+              </w:rPr>
+            </w:r>
+            <w:r>
+              <w:rPr>
+                <w:rFonts w:ascii="Arial" w:hAnsi="Arial" w:eastAsia="Arial" w:cs="Arial"/>
+                <w:sz w:val="22"/>
+                <w:szCs w:val="22"/>
+              </w:rPr>
+              <w:t xml:space="preserve">https://github.com/1montandon/Avaliacao01_UML</w:t>
+            </w:r>
+            <w:r>
+              <w:rPr>
+                <w:rFonts w:ascii="Arial" w:hAnsi="Arial" w:eastAsia="Arial" w:cs="Arial"/>
+                <w:sz w:val="22"/>
+                <w:szCs w:val="22"/>
+              </w:rPr>
+            </w:r>
+            <w:r/>
+          </w:p>
+        </w:tc>
+      </w:tr>
+    </w:tbl>
     <w:p>
       <w:pPr>
         <w:pBdr>
@@ -362,28 +479,34 @@
     </w:p>
     <w:p>
       <w:pPr>
-        <w:pStyle w:val="723"/>
-        <w:pBdr/>
-        <w:spacing/>
-        <w:ind/>
-        <w:rPr/>
+        <w:pStyle w:val="893"/>
+        <w:pBdr/>
+        <w:spacing/>
+        <w:ind/>
+        <w:rPr>
+          <w:color w:val="000000" w:themeColor="text1"/>
+        </w:rPr>
       </w:pPr>
       <w:r>
         <w:rPr>
           <w:rFonts w:ascii="Arial" w:hAnsi="Arial" w:eastAsia="Arial" w:cs="Arial"/>
           <w:b/>
           <w:bCs/>
-          <w:color w:val="1a237e"/>
+          <w:color w:val="000000" w:themeColor="text1"/>
           <w:sz w:val="36"/>
           <w:szCs w:val="36"/>
         </w:rPr>
         <w:t xml:space="preserve">Descrição dos Projetos</w:t>
       </w:r>
-      <w:r/>
+      <w:r>
+        <w:rPr>
+          <w:color w:val="000000" w:themeColor="text1"/>
+        </w:rPr>
+      </w:r>
     </w:p>
     <w:p>
       <w:pPr>
-        <w:pStyle w:val="724"/>
+        <w:pStyle w:val="894"/>
         <w:pBdr/>
         <w:spacing/>
         <w:ind/>
@@ -462,7 +585,7 @@
     </w:p>
     <w:p>
       <w:pPr>
-        <w:pStyle w:val="724"/>
+        <w:pStyle w:val="894"/>
         <w:pBdr/>
         <w:spacing/>
         <w:ind/>
@@ -512,11 +635,19 @@
     </w:p>
     <w:p>
       <w:pPr>
-        <w:pStyle w:val="723"/>
-        <w:pBdr/>
-        <w:spacing/>
-        <w:ind/>
-        <w:rPr/>
+        <w:pStyle w:val="893"/>
+        <w:pBdr/>
+        <w:spacing/>
+        <w:ind/>
+        <w:rPr>
+          <w:rFonts w:ascii="Arial" w:hAnsi="Arial" w:eastAsia="Arial" w:cs="Arial"/>
+          <w:b/>
+          <w:bCs/>
+          <w:color w:val="1a237e"/>
+          <w:sz w:val="36"/>
+          <w:szCs w:val="36"/>
+          <w:highlight w:val="none"/>
+        </w:rPr>
       </w:pPr>
       <w:r>
         <w:rPr>
@@ -526,10 +657,64 @@
           <w:color w:val="1a237e"/>
           <w:sz w:val="36"/>
           <w:szCs w:val="36"/>
+          <w:highlight w:val="none"/>
+        </w:rPr>
+      </w:r>
+      <w:r>
+        <w:rPr>
+          <w:rFonts w:ascii="Arial" w:hAnsi="Arial" w:eastAsia="Arial" w:cs="Arial"/>
+          <w:b/>
+          <w:bCs/>
+          <w:color w:val="1a237e"/>
+          <w:sz w:val="36"/>
+          <w:szCs w:val="36"/>
+          <w:highlight w:val="none"/>
+        </w:rPr>
+      </w:r>
+      <w:r>
+        <w:rPr>
+          <w:rFonts w:ascii="Arial" w:hAnsi="Arial" w:eastAsia="Arial" w:cs="Arial"/>
+          <w:b/>
+          <w:bCs/>
+          <w:color w:val="1a237e"/>
+          <w:sz w:val="36"/>
+          <w:szCs w:val="36"/>
+          <w:highlight w:val="none"/>
+        </w:rPr>
+      </w:r>
+    </w:p>
+    <w:p>
+      <w:pPr>
+        <w:pStyle w:val="893"/>
+        <w:pBdr/>
+        <w:spacing/>
+        <w:ind/>
+        <w:rPr>
+          <w:rFonts w:ascii="Arial" w:hAnsi="Arial" w:eastAsia="Arial" w:cs="Arial"/>
+          <w:b/>
+          <w:bCs/>
+          <w:color w:val="000000" w:themeColor="text1"/>
+          <w:sz w:val="36"/>
+          <w:szCs w:val="36"/>
+          <w:highlight w:val="none"/>
+        </w:rPr>
+      </w:pPr>
+      <w:r>
+        <w:rPr>
+          <w:rFonts w:ascii="Arial" w:hAnsi="Arial" w:eastAsia="Arial" w:cs="Arial"/>
+          <w:b/>
+          <w:bCs/>
+          <w:color w:val="000000" w:themeColor="text1"/>
+          <w:sz w:val="36"/>
+          <w:szCs w:val="36"/>
         </w:rPr>
         <w:t xml:space="preserve">Projeto #1 – Diagrama UML</w:t>
       </w:r>
-      <w:r/>
+      <w:r>
+        <w:rPr>
+          <w:color w:val="000000" w:themeColor="text1"/>
+        </w:rPr>
+      </w:r>
     </w:p>
     <w:p>
       <w:pPr>
@@ -630,24 +815,30 @@
     </w:p>
     <w:p>
       <w:pPr>
-        <w:pStyle w:val="723"/>
-        <w:pBdr/>
-        <w:spacing/>
-        <w:ind/>
-        <w:rPr/>
+        <w:pStyle w:val="893"/>
+        <w:pBdr/>
+        <w:spacing/>
+        <w:ind/>
+        <w:rPr>
+          <w:color w:val="000000" w:themeColor="text1"/>
+        </w:rPr>
       </w:pPr>
       <w:r>
         <w:rPr>
           <w:rFonts w:ascii="Arial" w:hAnsi="Arial" w:eastAsia="Arial" w:cs="Arial"/>
           <w:b/>
           <w:bCs/>
-          <w:color w:val="1a237e"/>
+          <w:color w:val="000000" w:themeColor="text1"/>
           <w:sz w:val="36"/>
           <w:szCs w:val="36"/>
         </w:rPr>
         <w:t xml:space="preserve">Projeto #2 – Diagrama UML</w:t>
       </w:r>
-      <w:r/>
+      <w:r>
+        <w:rPr>
+          <w:color w:val="000000" w:themeColor="text1"/>
+        </w:rPr>
+      </w:r>
     </w:p>
     <w:p>
       <w:pPr>
@@ -748,9 +939,10 @@
     </w:p>
     <w:p>
       <w:pPr>
-        <w:pStyle w:val="723"/>
-        <w:pBdr/>
-        <w:spacing/>
+        <w:pBdr>
+          <w:bottom w:val="single" w:color="cccccc" w:sz="6" w:space="0"/>
+        </w:pBdr>
+        <w:spacing w:after="200" w:before="200"/>
         <w:ind/>
         <w:rPr/>
       </w:pPr>
@@ -790,15 +982,16 @@
     </w:p>
     <w:p>
       <w:pPr>
-        <w:pStyle w:val="723"/>
-        <w:pBdr/>
-        <w:spacing/>
+        <w:pBdr>
+          <w:bottom w:val="single" w:color="cccccc" w:sz="6" w:space="0"/>
+        </w:pBdr>
+        <w:spacing w:after="200" w:before="200"/>
         <w:ind/>
         <w:rPr>
           <w:rFonts w:ascii="Arial" w:hAnsi="Arial" w:eastAsia="Arial" w:cs="Arial"/>
           <w:b/>
           <w:bCs/>
-          <w:color w:val="1a237e"/>
+          <w:color w:val="000000" w:themeColor="text1"/>
           <w:sz w:val="36"/>
           <w:szCs w:val="36"/>
           <w:highlight w:val="none"/>
@@ -806,13 +999,7 @@
       </w:pPr>
       <w:r>
         <w:rPr>
-          <w:rFonts w:ascii="Arial" w:hAnsi="Arial" w:eastAsia="Arial" w:cs="Arial"/>
-          <w:b/>
-          <w:bCs/>
-          <w:color w:val="1a237e"/>
-          <w:sz w:val="36"/>
-          <w:szCs w:val="36"/>
-          <w:highlight w:val="none"/>
+          <w:color w:val="000000" w:themeColor="text1"/>
         </w:rPr>
       </w:r>
       <w:r>
@@ -820,156 +1007,26 @@
           <w:rFonts w:ascii="Arial" w:hAnsi="Arial" w:eastAsia="Arial" w:cs="Arial"/>
           <w:b/>
           <w:bCs/>
-          <w:color w:val="1a237e"/>
-          <w:sz w:val="36"/>
-          <w:szCs w:val="36"/>
-          <w:highlight w:val="none"/>
-        </w:rPr>
-      </w:r>
-      <w:r>
-        <w:rPr>
-          <w:rFonts w:ascii="Arial" w:hAnsi="Arial" w:eastAsia="Arial" w:cs="Arial"/>
-          <w:b/>
-          <w:bCs/>
-          <w:color w:val="1a237e"/>
-          <w:sz w:val="36"/>
-          <w:szCs w:val="36"/>
-          <w:highlight w:val="none"/>
-        </w:rPr>
-      </w:r>
-    </w:p>
-    <w:p>
-      <w:pPr>
-        <w:pStyle w:val="723"/>
-        <w:pBdr/>
-        <w:spacing/>
-        <w:ind/>
-        <w:rPr>
-          <w:rFonts w:ascii="Arial" w:hAnsi="Arial" w:eastAsia="Arial" w:cs="Arial"/>
-          <w:b/>
-          <w:bCs/>
-          <w:color w:val="1a237e"/>
-          <w:sz w:val="36"/>
-          <w:szCs w:val="36"/>
-          <w:highlight w:val="none"/>
-        </w:rPr>
-      </w:pPr>
-      <w:r>
-        <w:rPr>
-          <w:rFonts w:ascii="Arial" w:hAnsi="Arial" w:eastAsia="Arial" w:cs="Arial"/>
-          <w:b/>
-          <w:bCs/>
-          <w:color w:val="1a237e"/>
-          <w:sz w:val="36"/>
-          <w:szCs w:val="36"/>
-          <w:highlight w:val="none"/>
-        </w:rPr>
-      </w:r>
-      <w:r>
-        <w:rPr>
-          <w:rFonts w:ascii="Arial" w:hAnsi="Arial" w:eastAsia="Arial" w:cs="Arial"/>
-          <w:b/>
-          <w:bCs/>
-          <w:color w:val="1a237e"/>
-          <w:sz w:val="36"/>
-          <w:szCs w:val="36"/>
-          <w:highlight w:val="none"/>
-        </w:rPr>
-      </w:r>
-      <w:r>
-        <w:rPr>
-          <w:rFonts w:ascii="Arial" w:hAnsi="Arial" w:eastAsia="Arial" w:cs="Arial"/>
-          <w:b/>
-          <w:bCs/>
-          <w:color w:val="1a237e"/>
-          <w:sz w:val="36"/>
-          <w:szCs w:val="36"/>
-          <w:highlight w:val="none"/>
-        </w:rPr>
-      </w:r>
-    </w:p>
-    <w:p>
-      <w:pPr>
-        <w:pStyle w:val="723"/>
-        <w:pBdr/>
-        <w:spacing/>
-        <w:ind/>
-        <w:rPr>
-          <w:rFonts w:ascii="Arial" w:hAnsi="Arial" w:eastAsia="Arial" w:cs="Arial"/>
-          <w:b/>
-          <w:bCs/>
-          <w:color w:val="1a237e"/>
-          <w:sz w:val="36"/>
-          <w:szCs w:val="36"/>
-          <w:highlight w:val="none"/>
-        </w:rPr>
-      </w:pPr>
-      <w:r>
-        <w:rPr>
-          <w:rFonts w:ascii="Arial" w:hAnsi="Arial" w:eastAsia="Arial" w:cs="Arial"/>
-          <w:b/>
-          <w:bCs/>
-          <w:color w:val="1a237e"/>
-          <w:sz w:val="36"/>
-          <w:szCs w:val="36"/>
-          <w:highlight w:val="none"/>
-        </w:rPr>
-      </w:r>
-      <w:r>
-        <w:rPr>
-          <w:rFonts w:ascii="Arial" w:hAnsi="Arial" w:eastAsia="Arial" w:cs="Arial"/>
-          <w:b/>
-          <w:bCs/>
-          <w:color w:val="1a237e"/>
-          <w:sz w:val="36"/>
-          <w:szCs w:val="36"/>
-          <w:highlight w:val="none"/>
-        </w:rPr>
-      </w:r>
-      <w:r>
-        <w:rPr>
-          <w:rFonts w:ascii="Arial" w:hAnsi="Arial" w:eastAsia="Arial" w:cs="Arial"/>
-          <w:b/>
-          <w:bCs/>
-          <w:color w:val="1a237e"/>
-          <w:sz w:val="36"/>
-          <w:szCs w:val="36"/>
-          <w:highlight w:val="none"/>
-        </w:rPr>
-      </w:r>
-    </w:p>
-    <w:p>
-      <w:pPr>
-        <w:pStyle w:val="723"/>
-        <w:pBdr/>
-        <w:spacing/>
-        <w:ind/>
-        <w:rPr>
-          <w:rFonts w:ascii="Arial" w:hAnsi="Arial" w:eastAsia="Arial" w:cs="Arial"/>
-          <w:b/>
-          <w:bCs/>
-          <w:color w:val="1a237e"/>
-          <w:sz w:val="36"/>
-          <w:szCs w:val="36"/>
-          <w:highlight w:val="none"/>
-        </w:rPr>
-      </w:pPr>
-      <w:r>
-        <w:rPr>
-          <w:rFonts w:ascii="Arial" w:hAnsi="Arial" w:eastAsia="Arial" w:cs="Arial"/>
-          <w:b/>
-          <w:bCs/>
-          <w:color w:val="1a237e"/>
+          <w:color w:val="000000" w:themeColor="text1"/>
           <w:sz w:val="36"/>
           <w:szCs w:val="36"/>
         </w:rPr>
         <w:t xml:space="preserve">Projeto #2 – Código-Fonte (TypeScript)</w:t>
       </w:r>
-      <w:r/>
+      <w:r>
+        <w:rPr>
+          <w:color w:val="000000" w:themeColor="text1"/>
+        </w:rPr>
+      </w:r>
+      <w:r>
+        <w:rPr>
+          <w:color w:val="000000" w:themeColor="text1"/>
+        </w:rPr>
+      </w:r>
     </w:p>
     <w:p>
       <w:pPr>
-        <w:pStyle w:val="724"/>
+        <w:pStyle w:val="894"/>
         <w:pBdr/>
         <w:spacing/>
         <w:ind/>
@@ -1152,7 +1209,7 @@
     </w:p>
     <w:p>
       <w:pPr>
-        <w:pStyle w:val="724"/>
+        <w:pStyle w:val="894"/>
         <w:pBdr/>
         <w:spacing/>
         <w:ind/>
@@ -1173,7 +1230,7 @@
     </w:p>
     <w:p>
       <w:pPr>
-        <w:pStyle w:val="715"/>
+        <w:pStyle w:val="885"/>
         <w:numPr>
           <w:ilvl w:val="0"/>
           <w:numId w:val="2"/>
@@ -1241,7 +1298,7 @@
     </w:p>
     <w:p>
       <w:pPr>
-        <w:pStyle w:val="724"/>
+        <w:pStyle w:val="894"/>
         <w:pBdr/>
         <w:spacing/>
         <w:ind/>
@@ -1406,7 +1463,7 @@
     </w:p>
     <w:p>
       <w:pPr>
-        <w:pStyle w:val="724"/>
+        <w:pStyle w:val="894"/>
         <w:pBdr/>
         <w:spacing/>
         <w:ind/>
@@ -4673,7 +4730,6 @@
         </w:rPr>
         <w:t xml:space="preserve">console.log(reserva1);</w:t>
       </w:r>
-      <w:r/>
       <w:r>
         <w:rPr>
           <w:rFonts w:ascii="Courier New" w:hAnsi="Courier New" w:eastAsia="Courier New" w:cs="Courier New"/>
@@ -4696,7 +4752,7 @@
     </w:p>
     <w:p>
       <w:pPr>
-        <w:pStyle w:val="724"/>
+        <w:pStyle w:val="894"/>
         <w:pBdr/>
         <w:spacing/>
         <w:ind/>
@@ -5663,7 +5719,6 @@
         </w:rPr>
         <w:t xml:space="preserve">}</w:t>
       </w:r>
-      <w:r/>
       <w:r>
         <w:rPr>
           <w:rFonts w:ascii="Courier New" w:hAnsi="Courier New" w:eastAsia="Courier New" w:cs="Courier New"/>
@@ -5706,7 +5761,6 @@
         <w:ind/>
         <w:rPr/>
       </w:pPr>
-      <w:r/>
       <w:r>
         <w:separator/>
       </w:r>
@@ -5721,7 +5775,6 @@
         <w:ind/>
         <w:rPr/>
       </w:pPr>
-      <w:r/>
       <w:r>
         <w:continuationSeparator/>
       </w:r>
@@ -5741,7 +5794,6 @@
         <w:ind/>
         <w:rPr/>
       </w:pPr>
-      <w:r/>
       <w:r>
         <w:separator/>
       </w:r>
@@ -5756,7 +5808,6 @@
         <w:ind/>
         <w:rPr/>
       </w:pPr>
-      <w:r/>
       <w:r>
         <w:continuationSeparator/>
       </w:r>
@@ -6196,7 +6247,7 @@
     <w:lsdException w:name="Bibliography" w:uiPriority="37"/>
     <w:lsdException w:name="TOC Heading" w:uiPriority="39" w:qFormat="1"/>
   </w:latentStyles>
-  <w:style w:type="table" w:styleId="11" w:default="1">
+  <w:style w:type="table" w:styleId="705" w:default="1">
     <w:name w:val="Normal Table"/>
     <w:uiPriority w:val="99"/>
     <w:semiHidden/>
@@ -6389,9 +6440,9 @@
       </w:tcPr>
     </w:tblStylePr>
   </w:style>
-  <w:style w:type="table" w:styleId="12">
+  <w:style w:type="table" w:styleId="706">
     <w:name w:val="Table Grid"/>
-    <w:basedOn w:val="11"/>
+    <w:basedOn w:val="705"/>
     <w:uiPriority w:val="59"/>
     <w:pPr>
       <w:pBdr/>
@@ -6588,9 +6639,9 @@
       </w:tcPr>
     </w:tblStylePr>
   </w:style>
-  <w:style w:type="table" w:styleId="13">
+  <w:style w:type="table" w:styleId="707">
     <w:name w:val="Table Grid Light"/>
-    <w:basedOn w:val="11"/>
+    <w:basedOn w:val="705"/>
     <w:uiPriority w:val="59"/>
     <w:pPr>
       <w:pBdr/>
@@ -6787,9 +6838,9 @@
       </w:tcPr>
     </w:tblStylePr>
   </w:style>
-  <w:style w:type="table" w:styleId="14">
+  <w:style w:type="table" w:styleId="708">
     <w:name w:val="Plain Table 1"/>
-    <w:basedOn w:val="11"/>
+    <w:basedOn w:val="705"/>
     <w:uiPriority w:val="59"/>
     <w:pPr>
       <w:pBdr/>
@@ -7012,9 +7063,9 @@
       </w:tcPr>
     </w:tblStylePr>
   </w:style>
-  <w:style w:type="table" w:styleId="15">
+  <w:style w:type="table" w:styleId="709">
     <w:name w:val="Plain Table 2"/>
-    <w:basedOn w:val="11"/>
+    <w:basedOn w:val="705"/>
     <w:uiPriority w:val="59"/>
     <w:pPr>
       <w:pBdr/>
@@ -7245,9 +7296,9 @@
       </w:tcPr>
     </w:tblStylePr>
   </w:style>
-  <w:style w:type="table" w:styleId="16">
+  <w:style w:type="table" w:styleId="710">
     <w:name w:val="Plain Table 3"/>
-    <w:basedOn w:val="11"/>
+    <w:basedOn w:val="705"/>
     <w:uiPriority w:val="99"/>
     <w:pPr>
       <w:pBdr/>
@@ -7475,9 +7526,9 @@
       </w:tcPr>
     </w:tblStylePr>
   </w:style>
-  <w:style w:type="table" w:styleId="17">
+  <w:style w:type="table" w:styleId="711">
     <w:name w:val="Plain Table 4"/>
-    <w:basedOn w:val="11"/>
+    <w:basedOn w:val="705"/>
     <w:uiPriority w:val="99"/>
     <w:pPr>
       <w:pBdr/>
@@ -7691,9 +7742,9 @@
       </w:tcPr>
     </w:tblStylePr>
   </w:style>
-  <w:style w:type="table" w:styleId="18">
+  <w:style w:type="table" w:styleId="712">
     <w:name w:val="Plain Table 5"/>
-    <w:basedOn w:val="11"/>
+    <w:basedOn w:val="705"/>
     <w:uiPriority w:val="99"/>
     <w:pPr>
       <w:pBdr/>
@@ -7924,9 +7975,9 @@
       </w:tcPr>
     </w:tblStylePr>
   </w:style>
-  <w:style w:type="table" w:styleId="19">
+  <w:style w:type="table" w:styleId="713">
     <w:name w:val="Grid Table 1 Light"/>
-    <w:basedOn w:val="11"/>
+    <w:basedOn w:val="705"/>
     <w:uiPriority w:val="99"/>
     <w:pPr>
       <w:pBdr/>
@@ -8147,9 +8198,9 @@
       </w:tcPr>
     </w:tblStylePr>
   </w:style>
-  <w:style w:type="table" w:styleId="20">
+  <w:style w:type="table" w:styleId="714">
     <w:name w:val="Grid Table 1 Light - Accent 1"/>
-    <w:basedOn w:val="11"/>
+    <w:basedOn w:val="705"/>
     <w:uiPriority w:val="99"/>
     <w:pPr>
       <w:pBdr/>
@@ -8370,9 +8421,9 @@
       </w:tcPr>
     </w:tblStylePr>
   </w:style>
-  <w:style w:type="table" w:styleId="21">
+  <w:style w:type="table" w:styleId="715">
     <w:name w:val="Grid Table 1 Light - Accent 2"/>
-    <w:basedOn w:val="11"/>
+    <w:basedOn w:val="705"/>
     <w:uiPriority w:val="99"/>
     <w:pPr>
       <w:pBdr/>
@@ -8593,9 +8644,9 @@
       </w:tcPr>
     </w:tblStylePr>
   </w:style>
-  <w:style w:type="table" w:styleId="22">
+  <w:style w:type="table" w:styleId="716">
     <w:name w:val="Grid Table 1 Light - Accent 3"/>
-    <w:basedOn w:val="11"/>
+    <w:basedOn w:val="705"/>
     <w:uiPriority w:val="99"/>
     <w:pPr>
       <w:pBdr/>
@@ -8816,9 +8867,9 @@
       </w:tcPr>
     </w:tblStylePr>
   </w:style>
-  <w:style w:type="table" w:styleId="23">
+  <w:style w:type="table" w:styleId="717">
     <w:name w:val="Grid Table 1 Light - Accent 4"/>
-    <w:basedOn w:val="11"/>
+    <w:basedOn w:val="705"/>
     <w:uiPriority w:val="99"/>
     <w:pPr>
       <w:pBdr/>
@@ -9039,9 +9090,9 @@
       </w:tcPr>
     </w:tblStylePr>
   </w:style>
-  <w:style w:type="table" w:styleId="24">
+  <w:style w:type="table" w:styleId="718">
     <w:name w:val="Grid Table 1 Light - Accent 5"/>
-    <w:basedOn w:val="11"/>
+    <w:basedOn w:val="705"/>
     <w:uiPriority w:val="99"/>
     <w:pPr>
       <w:pBdr/>
@@ -9262,9 +9313,9 @@
       </w:tcPr>
     </w:tblStylePr>
   </w:style>
-  <w:style w:type="table" w:styleId="25">
+  <w:style w:type="table" w:styleId="719">
     <w:name w:val="Grid Table 1 Light - Accent 6"/>
-    <w:basedOn w:val="11"/>
+    <w:basedOn w:val="705"/>
     <w:uiPriority w:val="99"/>
     <w:pPr>
       <w:pBdr/>
@@ -9485,9 +9536,9 @@
       </w:tcPr>
     </w:tblStylePr>
   </w:style>
-  <w:style w:type="table" w:styleId="26">
+  <w:style w:type="table" w:styleId="720">
     <w:name w:val="Grid Table 2"/>
-    <w:basedOn w:val="11"/>
+    <w:basedOn w:val="705"/>
     <w:uiPriority w:val="99"/>
     <w:pPr>
       <w:pBdr/>
@@ -9717,9 +9768,9 @@
       </w:tcPr>
     </w:tblStylePr>
   </w:style>
-  <w:style w:type="table" w:styleId="27">
+  <w:style w:type="table" w:styleId="721">
     <w:name w:val="Grid Table 2 - Accent 1"/>
-    <w:basedOn w:val="11"/>
+    <w:basedOn w:val="705"/>
     <w:uiPriority w:val="99"/>
     <w:pPr>
       <w:pBdr/>
@@ -9949,9 +10000,9 @@
       </w:tcPr>
     </w:tblStylePr>
   </w:style>
-  <w:style w:type="table" w:styleId="28">
+  <w:style w:type="table" w:styleId="722">
     <w:name w:val="Grid Table 2 - Accent 2"/>
-    <w:basedOn w:val="11"/>
+    <w:basedOn w:val="705"/>
     <w:uiPriority w:val="99"/>
     <w:pPr>
       <w:pBdr/>
@@ -10181,9 +10232,9 @@
       </w:tcPr>
     </w:tblStylePr>
   </w:style>
-  <w:style w:type="table" w:styleId="29">
+  <w:style w:type="table" w:styleId="723">
     <w:name w:val="Grid Table 2 - Accent 3"/>
-    <w:basedOn w:val="11"/>
+    <w:basedOn w:val="705"/>
     <w:uiPriority w:val="99"/>
     <w:pPr>
       <w:pBdr/>
@@ -10413,9 +10464,9 @@
       </w:tcPr>
     </w:tblStylePr>
   </w:style>
-  <w:style w:type="table" w:styleId="30">
+  <w:style w:type="table" w:styleId="724">
     <w:name w:val="Grid Table 2 - Accent 4"/>
-    <w:basedOn w:val="11"/>
+    <w:basedOn w:val="705"/>
     <w:uiPriority w:val="99"/>
     <w:pPr>
       <w:pBdr/>
@@ -10645,9 +10696,9 @@
       </w:tcPr>
     </w:tblStylePr>
   </w:style>
-  <w:style w:type="table" w:styleId="31">
+  <w:style w:type="table" w:styleId="725">
     <w:name w:val="Grid Table 2 - Accent 5"/>
-    <w:basedOn w:val="11"/>
+    <w:basedOn w:val="705"/>
     <w:uiPriority w:val="99"/>
     <w:pPr>
       <w:pBdr/>
@@ -10877,9 +10928,9 @@
       </w:tcPr>
     </w:tblStylePr>
   </w:style>
-  <w:style w:type="table" w:styleId="32">
+  <w:style w:type="table" w:styleId="726">
     <w:name w:val="Grid Table 2 - Accent 6"/>
-    <w:basedOn w:val="11"/>
+    <w:basedOn w:val="705"/>
     <w:uiPriority w:val="99"/>
     <w:pPr>
       <w:pBdr/>
@@ -11109,9 +11160,9 @@
       </w:tcPr>
     </w:tblStylePr>
   </w:style>
-  <w:style w:type="table" w:styleId="33">
+  <w:style w:type="table" w:styleId="727">
     <w:name w:val="Grid Table 3"/>
-    <w:basedOn w:val="11"/>
+    <w:basedOn w:val="705"/>
     <w:uiPriority w:val="99"/>
     <w:pPr>
       <w:pBdr/>
@@ -11210,29 +11261,6 @@
         <w:tblBorders/>
       </w:tblPr>
       <w:tcPr>
-        <w:shd w:color="ffffff"/>
-        <w:tcBorders>
-          <w:top w:val="none" w:color="000000" w:sz="4" w:space="0"/>
-          <w:left w:val="none" w:color="000000" w:sz="4" w:space="0"/>
-          <w:bottom w:val="none" w:color="000000" w:sz="4" w:space="0"/>
-          <w:right w:val="none" w:color="000000" w:sz="4" w:space="0"/>
-        </w:tcBorders>
-      </w:tcPr>
-    </w:tblStylePr>
-    <w:tblStylePr w:type="firstRow">
-      <w:rPr>
-        <w:b/>
-        <w:color w:val="404040"/>
-      </w:rPr>
-      <w:pPr>
-        <w:pBdr/>
-        <w:spacing/>
-        <w:ind/>
-      </w:pPr>
-      <w:tblPr>
-        <w:tblBorders/>
-      </w:tblPr>
-      <w:tcPr>
         <w:shd w:val="clear" w:color="ffffff"/>
         <w:tcBorders>
           <w:top w:val="none" w:color="000000" w:sz="4" w:space="0"/>
@@ -11242,30 +11270,7 @@
         </w:tcBorders>
       </w:tcPr>
     </w:tblStylePr>
-    <w:tblStylePr w:type="lastCol">
-      <w:rPr>
-        <w:i/>
-        <w:color w:val="404040"/>
-      </w:rPr>
-      <w:pPr>
-        <w:pBdr/>
-        <w:spacing/>
-        <w:ind/>
-      </w:pPr>
-      <w:tblPr>
-        <w:tblBorders/>
-      </w:tblPr>
-      <w:tcPr>
-        <w:shd w:color="ffffff"/>
-        <w:tcBorders>
-          <w:top w:val="none" w:color="000000" w:sz="4" w:space="0"/>
-          <w:left w:val="none" w:color="000000" w:sz="4" w:space="0"/>
-          <w:bottom w:val="none" w:color="000000" w:sz="4" w:space="0"/>
-          <w:right w:val="none" w:color="000000" w:sz="4" w:space="0"/>
-        </w:tcBorders>
-      </w:tcPr>
-    </w:tblStylePr>
-    <w:tblStylePr w:type="lastRow">
+    <w:tblStylePr w:type="firstRow">
       <w:rPr>
         <w:b/>
         <w:color w:val="404040"/>
@@ -11288,6 +11293,52 @@
         </w:tcBorders>
       </w:tcPr>
     </w:tblStylePr>
+    <w:tblStylePr w:type="lastCol">
+      <w:rPr>
+        <w:i/>
+        <w:color w:val="404040"/>
+      </w:rPr>
+      <w:pPr>
+        <w:pBdr/>
+        <w:spacing/>
+        <w:ind/>
+      </w:pPr>
+      <w:tblPr>
+        <w:tblBorders/>
+      </w:tblPr>
+      <w:tcPr>
+        <w:shd w:val="clear" w:color="ffffff"/>
+        <w:tcBorders>
+          <w:top w:val="none" w:color="000000" w:sz="4" w:space="0"/>
+          <w:left w:val="none" w:color="000000" w:sz="4" w:space="0"/>
+          <w:bottom w:val="none" w:color="000000" w:sz="4" w:space="0"/>
+          <w:right w:val="none" w:color="000000" w:sz="4" w:space="0"/>
+        </w:tcBorders>
+      </w:tcPr>
+    </w:tblStylePr>
+    <w:tblStylePr w:type="lastRow">
+      <w:rPr>
+        <w:b/>
+        <w:color w:val="404040"/>
+      </w:rPr>
+      <w:pPr>
+        <w:pBdr/>
+        <w:spacing/>
+        <w:ind/>
+      </w:pPr>
+      <w:tblPr>
+        <w:tblBorders/>
+      </w:tblPr>
+      <w:tcPr>
+        <w:shd w:val="clear" w:color="ffffff"/>
+        <w:tcBorders>
+          <w:top w:val="none" w:color="000000" w:sz="4" w:space="0"/>
+          <w:left w:val="none" w:color="000000" w:sz="4" w:space="0"/>
+          <w:bottom w:val="none" w:color="000000" w:sz="4" w:space="0"/>
+          <w:right w:val="none" w:color="000000" w:sz="4" w:space="0"/>
+        </w:tcBorders>
+      </w:tcPr>
+    </w:tblStylePr>
     <w:tblStylePr w:type="nwCell">
       <w:pPr>
         <w:pBdr/>
@@ -11354,9 +11405,9 @@
       </w:tcPr>
     </w:tblStylePr>
   </w:style>
-  <w:style w:type="table" w:styleId="34">
+  <w:style w:type="table" w:styleId="728">
     <w:name w:val="Grid Table 3 - Accent 1"/>
-    <w:basedOn w:val="11"/>
+    <w:basedOn w:val="705"/>
     <w:uiPriority w:val="99"/>
     <w:pPr>
       <w:pBdr/>
@@ -11455,29 +11506,6 @@
         <w:tblBorders/>
       </w:tblPr>
       <w:tcPr>
-        <w:shd w:color="ffffff"/>
-        <w:tcBorders>
-          <w:top w:val="none" w:color="000000" w:sz="4" w:space="0"/>
-          <w:left w:val="none" w:color="000000" w:sz="4" w:space="0"/>
-          <w:bottom w:val="none" w:color="000000" w:sz="4" w:space="0"/>
-          <w:right w:val="none" w:color="000000" w:sz="4" w:space="0"/>
-        </w:tcBorders>
-      </w:tcPr>
-    </w:tblStylePr>
-    <w:tblStylePr w:type="firstRow">
-      <w:rPr>
-        <w:b/>
-        <w:color w:val="404040"/>
-      </w:rPr>
-      <w:pPr>
-        <w:pBdr/>
-        <w:spacing/>
-        <w:ind/>
-      </w:pPr>
-      <w:tblPr>
-        <w:tblBorders/>
-      </w:tblPr>
-      <w:tcPr>
         <w:shd w:val="clear" w:color="ffffff"/>
         <w:tcBorders>
           <w:top w:val="none" w:color="000000" w:sz="4" w:space="0"/>
@@ -11487,30 +11515,7 @@
         </w:tcBorders>
       </w:tcPr>
     </w:tblStylePr>
-    <w:tblStylePr w:type="lastCol">
-      <w:rPr>
-        <w:i/>
-        <w:color w:val="404040"/>
-      </w:rPr>
-      <w:pPr>
-        <w:pBdr/>
-        <w:spacing/>
-        <w:ind/>
-      </w:pPr>
-      <w:tblPr>
-        <w:tblBorders/>
-      </w:tblPr>
-      <w:tcPr>
-        <w:shd w:color="ffffff"/>
-        <w:tcBorders>
-          <w:top w:val="none" w:color="000000" w:sz="4" w:space="0"/>
-          <w:left w:val="none" w:color="000000" w:sz="4" w:space="0"/>
-          <w:bottom w:val="none" w:color="000000" w:sz="4" w:space="0"/>
-          <w:right w:val="none" w:color="000000" w:sz="4" w:space="0"/>
-        </w:tcBorders>
-      </w:tcPr>
-    </w:tblStylePr>
-    <w:tblStylePr w:type="lastRow">
+    <w:tblStylePr w:type="firstRow">
       <w:rPr>
         <w:b/>
         <w:color w:val="404040"/>
@@ -11533,6 +11538,52 @@
         </w:tcBorders>
       </w:tcPr>
     </w:tblStylePr>
+    <w:tblStylePr w:type="lastCol">
+      <w:rPr>
+        <w:i/>
+        <w:color w:val="404040"/>
+      </w:rPr>
+      <w:pPr>
+        <w:pBdr/>
+        <w:spacing/>
+        <w:ind/>
+      </w:pPr>
+      <w:tblPr>
+        <w:tblBorders/>
+      </w:tblPr>
+      <w:tcPr>
+        <w:shd w:val="clear" w:color="ffffff"/>
+        <w:tcBorders>
+          <w:top w:val="none" w:color="000000" w:sz="4" w:space="0"/>
+          <w:left w:val="none" w:color="000000" w:sz="4" w:space="0"/>
+          <w:bottom w:val="none" w:color="000000" w:sz="4" w:space="0"/>
+          <w:right w:val="none" w:color="000000" w:sz="4" w:space="0"/>
+        </w:tcBorders>
+      </w:tcPr>
+    </w:tblStylePr>
+    <w:tblStylePr w:type="lastRow">
+      <w:rPr>
+        <w:b/>
+        <w:color w:val="404040"/>
+      </w:rPr>
+      <w:pPr>
+        <w:pBdr/>
+        <w:spacing/>
+        <w:ind/>
+      </w:pPr>
+      <w:tblPr>
+        <w:tblBorders/>
+      </w:tblPr>
+      <w:tcPr>
+        <w:shd w:val="clear" w:color="ffffff"/>
+        <w:tcBorders>
+          <w:top w:val="none" w:color="000000" w:sz="4" w:space="0"/>
+          <w:left w:val="none" w:color="000000" w:sz="4" w:space="0"/>
+          <w:bottom w:val="none" w:color="000000" w:sz="4" w:space="0"/>
+          <w:right w:val="none" w:color="000000" w:sz="4" w:space="0"/>
+        </w:tcBorders>
+      </w:tcPr>
+    </w:tblStylePr>
     <w:tblStylePr w:type="nwCell">
       <w:pPr>
         <w:pBdr/>
@@ -11599,9 +11650,9 @@
       </w:tcPr>
     </w:tblStylePr>
   </w:style>
-  <w:style w:type="table" w:styleId="35">
+  <w:style w:type="table" w:styleId="729">
     <w:name w:val="Grid Table 3 - Accent 2"/>
-    <w:basedOn w:val="11"/>
+    <w:basedOn w:val="705"/>
     <w:uiPriority w:val="99"/>
     <w:pPr>
       <w:pBdr/>
@@ -11700,29 +11751,6 @@
         <w:tblBorders/>
       </w:tblPr>
       <w:tcPr>
-        <w:shd w:color="ffffff"/>
-        <w:tcBorders>
-          <w:top w:val="none" w:color="000000" w:sz="4" w:space="0"/>
-          <w:left w:val="none" w:color="000000" w:sz="4" w:space="0"/>
-          <w:bottom w:val="none" w:color="000000" w:sz="4" w:space="0"/>
-          <w:right w:val="none" w:color="000000" w:sz="4" w:space="0"/>
-        </w:tcBorders>
-      </w:tcPr>
-    </w:tblStylePr>
-    <w:tblStylePr w:type="firstRow">
-      <w:rPr>
-        <w:b/>
-        <w:color w:val="404040"/>
-      </w:rPr>
-      <w:pPr>
-        <w:pBdr/>
-        <w:spacing/>
-        <w:ind/>
-      </w:pPr>
-      <w:tblPr>
-        <w:tblBorders/>
-      </w:tblPr>
-      <w:tcPr>
         <w:shd w:val="clear" w:color="ffffff"/>
         <w:tcBorders>
           <w:top w:val="none" w:color="000000" w:sz="4" w:space="0"/>
@@ -11732,30 +11760,7 @@
         </w:tcBorders>
       </w:tcPr>
     </w:tblStylePr>
-    <w:tblStylePr w:type="lastCol">
-      <w:rPr>
-        <w:i/>
-        <w:color w:val="404040"/>
-      </w:rPr>
-      <w:pPr>
-        <w:pBdr/>
-        <w:spacing/>
-        <w:ind/>
-      </w:pPr>
-      <w:tblPr>
-        <w:tblBorders/>
-      </w:tblPr>
-      <w:tcPr>
-        <w:shd w:color="ffffff"/>
-        <w:tcBorders>
-          <w:top w:val="none" w:color="000000" w:sz="4" w:space="0"/>
-          <w:left w:val="none" w:color="000000" w:sz="4" w:space="0"/>
-          <w:bottom w:val="none" w:color="000000" w:sz="4" w:space="0"/>
-          <w:right w:val="none" w:color="000000" w:sz="4" w:space="0"/>
-        </w:tcBorders>
-      </w:tcPr>
-    </w:tblStylePr>
-    <w:tblStylePr w:type="lastRow">
+    <w:tblStylePr w:type="firstRow">
       <w:rPr>
         <w:b/>
         <w:color w:val="404040"/>
@@ -11778,6 +11783,52 @@
         </w:tcBorders>
       </w:tcPr>
     </w:tblStylePr>
+    <w:tblStylePr w:type="lastCol">
+      <w:rPr>
+        <w:i/>
+        <w:color w:val="404040"/>
+      </w:rPr>
+      <w:pPr>
+        <w:pBdr/>
+        <w:spacing/>
+        <w:ind/>
+      </w:pPr>
+      <w:tblPr>
+        <w:tblBorders/>
+      </w:tblPr>
+      <w:tcPr>
+        <w:shd w:val="clear" w:color="ffffff"/>
+        <w:tcBorders>
+          <w:top w:val="none" w:color="000000" w:sz="4" w:space="0"/>
+          <w:left w:val="none" w:color="000000" w:sz="4" w:space="0"/>
+          <w:bottom w:val="none" w:color="000000" w:sz="4" w:space="0"/>
+          <w:right w:val="none" w:color="000000" w:sz="4" w:space="0"/>
+        </w:tcBorders>
+      </w:tcPr>
+    </w:tblStylePr>
+    <w:tblStylePr w:type="lastRow">
+      <w:rPr>
+        <w:b/>
+        <w:color w:val="404040"/>
+      </w:rPr>
+      <w:pPr>
+        <w:pBdr/>
+        <w:spacing/>
+        <w:ind/>
+      </w:pPr>
+      <w:tblPr>
+        <w:tblBorders/>
+      </w:tblPr>
+      <w:tcPr>
+        <w:shd w:val="clear" w:color="ffffff"/>
+        <w:tcBorders>
+          <w:top w:val="none" w:color="000000" w:sz="4" w:space="0"/>
+          <w:left w:val="none" w:color="000000" w:sz="4" w:space="0"/>
+          <w:bottom w:val="none" w:color="000000" w:sz="4" w:space="0"/>
+          <w:right w:val="none" w:color="000000" w:sz="4" w:space="0"/>
+        </w:tcBorders>
+      </w:tcPr>
+    </w:tblStylePr>
     <w:tblStylePr w:type="nwCell">
       <w:pPr>
         <w:pBdr/>
@@ -11844,9 +11895,9 @@
       </w:tcPr>
     </w:tblStylePr>
   </w:style>
-  <w:style w:type="table" w:styleId="36">
+  <w:style w:type="table" w:styleId="730">
     <w:name w:val="Grid Table 3 - Accent 3"/>
-    <w:basedOn w:val="11"/>
+    <w:basedOn w:val="705"/>
     <w:uiPriority w:val="99"/>
     <w:pPr>
       <w:pBdr/>
@@ -11945,29 +11996,6 @@
         <w:tblBorders/>
       </w:tblPr>
       <w:tcPr>
-        <w:shd w:color="ffffff"/>
-        <w:tcBorders>
-          <w:top w:val="none" w:color="000000" w:sz="4" w:space="0"/>
-          <w:left w:val="none" w:color="000000" w:sz="4" w:space="0"/>
-          <w:bottom w:val="none" w:color="000000" w:sz="4" w:space="0"/>
-          <w:right w:val="none" w:color="000000" w:sz="4" w:space="0"/>
-        </w:tcBorders>
-      </w:tcPr>
-    </w:tblStylePr>
-    <w:tblStylePr w:type="firstRow">
-      <w:rPr>
-        <w:b/>
-        <w:color w:val="404040"/>
-      </w:rPr>
-      <w:pPr>
-        <w:pBdr/>
-        <w:spacing/>
-        <w:ind/>
-      </w:pPr>
-      <w:tblPr>
-        <w:tblBorders/>
-      </w:tblPr>
-      <w:tcPr>
         <w:shd w:val="clear" w:color="ffffff"/>
         <w:tcBorders>
           <w:top w:val="none" w:color="000000" w:sz="4" w:space="0"/>
@@ -11977,30 +12005,7 @@
         </w:tcBorders>
       </w:tcPr>
     </w:tblStylePr>
-    <w:tblStylePr w:type="lastCol">
-      <w:rPr>
-        <w:i/>
-        <w:color w:val="404040"/>
-      </w:rPr>
-      <w:pPr>
-        <w:pBdr/>
-        <w:spacing/>
-        <w:ind/>
-      </w:pPr>
-      <w:tblPr>
-        <w:tblBorders/>
-      </w:tblPr>
-      <w:tcPr>
-        <w:shd w:color="ffffff"/>
-        <w:tcBorders>
-          <w:top w:val="none" w:color="000000" w:sz="4" w:space="0"/>
-          <w:left w:val="none" w:color="000000" w:sz="4" w:space="0"/>
-          <w:bottom w:val="none" w:color="000000" w:sz="4" w:space="0"/>
-          <w:right w:val="none" w:color="000000" w:sz="4" w:space="0"/>
-        </w:tcBorders>
-      </w:tcPr>
-    </w:tblStylePr>
-    <w:tblStylePr w:type="lastRow">
+    <w:tblStylePr w:type="firstRow">
       <w:rPr>
         <w:b/>
         <w:color w:val="404040"/>
@@ -12023,6 +12028,52 @@
         </w:tcBorders>
       </w:tcPr>
     </w:tblStylePr>
+    <w:tblStylePr w:type="lastCol">
+      <w:rPr>
+        <w:i/>
+        <w:color w:val="404040"/>
+      </w:rPr>
+      <w:pPr>
+        <w:pBdr/>
+        <w:spacing/>
+        <w:ind/>
+      </w:pPr>
+      <w:tblPr>
+        <w:tblBorders/>
+      </w:tblPr>
+      <w:tcPr>
+        <w:shd w:val="clear" w:color="ffffff"/>
+        <w:tcBorders>
+          <w:top w:val="none" w:color="000000" w:sz="4" w:space="0"/>
+          <w:left w:val="none" w:color="000000" w:sz="4" w:space="0"/>
+          <w:bottom w:val="none" w:color="000000" w:sz="4" w:space="0"/>
+          <w:right w:val="none" w:color="000000" w:sz="4" w:space="0"/>
+        </w:tcBorders>
+      </w:tcPr>
+    </w:tblStylePr>
+    <w:tblStylePr w:type="lastRow">
+      <w:rPr>
+        <w:b/>
+        <w:color w:val="404040"/>
+      </w:rPr>
+      <w:pPr>
+        <w:pBdr/>
+        <w:spacing/>
+        <w:ind/>
+      </w:pPr>
+      <w:tblPr>
+        <w:tblBorders/>
+      </w:tblPr>
+      <w:tcPr>
+        <w:shd w:val="clear" w:color="ffffff"/>
+        <w:tcBorders>
+          <w:top w:val="none" w:color="000000" w:sz="4" w:space="0"/>
+          <w:left w:val="none" w:color="000000" w:sz="4" w:space="0"/>
+          <w:bottom w:val="none" w:color="000000" w:sz="4" w:space="0"/>
+          <w:right w:val="none" w:color="000000" w:sz="4" w:space="0"/>
+        </w:tcBorders>
+      </w:tcPr>
+    </w:tblStylePr>
     <w:tblStylePr w:type="nwCell">
       <w:pPr>
         <w:pBdr/>
@@ -12089,9 +12140,9 @@
       </w:tcPr>
     </w:tblStylePr>
   </w:style>
-  <w:style w:type="table" w:styleId="37">
+  <w:style w:type="table" w:styleId="731">
     <w:name w:val="Grid Table 3 - Accent 4"/>
-    <w:basedOn w:val="11"/>
+    <w:basedOn w:val="705"/>
     <w:uiPriority w:val="99"/>
     <w:pPr>
       <w:pBdr/>
@@ -12190,29 +12241,6 @@
         <w:tblBorders/>
       </w:tblPr>
       <w:tcPr>
-        <w:shd w:color="ffffff"/>
-        <w:tcBorders>
-          <w:top w:val="none" w:color="000000" w:sz="4" w:space="0"/>
-          <w:left w:val="none" w:color="000000" w:sz="4" w:space="0"/>
-          <w:bottom w:val="none" w:color="000000" w:sz="4" w:space="0"/>
-          <w:right w:val="none" w:color="000000" w:sz="4" w:space="0"/>
-        </w:tcBorders>
-      </w:tcPr>
-    </w:tblStylePr>
-    <w:tblStylePr w:type="firstRow">
-      <w:rPr>
-        <w:b/>
-        <w:color w:val="404040"/>
-      </w:rPr>
-      <w:pPr>
-        <w:pBdr/>
-        <w:spacing/>
-        <w:ind/>
-      </w:pPr>
-      <w:tblPr>
-        <w:tblBorders/>
-      </w:tblPr>
-      <w:tcPr>
         <w:shd w:val="clear" w:color="ffffff"/>
         <w:tcBorders>
           <w:top w:val="none" w:color="000000" w:sz="4" w:space="0"/>
@@ -12222,30 +12250,7 @@
         </w:tcBorders>
       </w:tcPr>
     </w:tblStylePr>
-    <w:tblStylePr w:type="lastCol">
-      <w:rPr>
-        <w:i/>
-        <w:color w:val="404040"/>
-      </w:rPr>
-      <w:pPr>
-        <w:pBdr/>
-        <w:spacing/>
-        <w:ind/>
-      </w:pPr>
-      <w:tblPr>
-        <w:tblBorders/>
-      </w:tblPr>
-      <w:tcPr>
-        <w:shd w:color="ffffff"/>
-        <w:tcBorders>
-          <w:top w:val="none" w:color="000000" w:sz="4" w:space="0"/>
-          <w:left w:val="none" w:color="000000" w:sz="4" w:space="0"/>
-          <w:bottom w:val="none" w:color="000000" w:sz="4" w:space="0"/>
-          <w:right w:val="none" w:color="000000" w:sz="4" w:space="0"/>
-        </w:tcBorders>
-      </w:tcPr>
-    </w:tblStylePr>
-    <w:tblStylePr w:type="lastRow">
+    <w:tblStylePr w:type="firstRow">
       <w:rPr>
         <w:b/>
         <w:color w:val="404040"/>
@@ -12268,6 +12273,52 @@
         </w:tcBorders>
       </w:tcPr>
     </w:tblStylePr>
+    <w:tblStylePr w:type="lastCol">
+      <w:rPr>
+        <w:i/>
+        <w:color w:val="404040"/>
+      </w:rPr>
+      <w:pPr>
+        <w:pBdr/>
+        <w:spacing/>
+        <w:ind/>
+      </w:pPr>
+      <w:tblPr>
+        <w:tblBorders/>
+      </w:tblPr>
+      <w:tcPr>
+        <w:shd w:val="clear" w:color="ffffff"/>
+        <w:tcBorders>
+          <w:top w:val="none" w:color="000000" w:sz="4" w:space="0"/>
+          <w:left w:val="none" w:color="000000" w:sz="4" w:space="0"/>
+          <w:bottom w:val="none" w:color="000000" w:sz="4" w:space="0"/>
+          <w:right w:val="none" w:color="000000" w:sz="4" w:space="0"/>
+        </w:tcBorders>
+      </w:tcPr>
+    </w:tblStylePr>
+    <w:tblStylePr w:type="lastRow">
+      <w:rPr>
+        <w:b/>
+        <w:color w:val="404040"/>
+      </w:rPr>
+      <w:pPr>
+        <w:pBdr/>
+        <w:spacing/>
+        <w:ind/>
+      </w:pPr>
+      <w:tblPr>
+        <w:tblBorders/>
+      </w:tblPr>
+      <w:tcPr>
+        <w:shd w:val="clear" w:color="ffffff"/>
+        <w:tcBorders>
+          <w:top w:val="none" w:color="000000" w:sz="4" w:space="0"/>
+          <w:left w:val="none" w:color="000000" w:sz="4" w:space="0"/>
+          <w:bottom w:val="none" w:color="000000" w:sz="4" w:space="0"/>
+          <w:right w:val="none" w:color="000000" w:sz="4" w:space="0"/>
+        </w:tcBorders>
+      </w:tcPr>
+    </w:tblStylePr>
     <w:tblStylePr w:type="nwCell">
       <w:pPr>
         <w:pBdr/>
@@ -12334,9 +12385,9 @@
       </w:tcPr>
     </w:tblStylePr>
   </w:style>
-  <w:style w:type="table" w:styleId="38">
+  <w:style w:type="table" w:styleId="732">
     <w:name w:val="Grid Table 3 - Accent 5"/>
-    <w:basedOn w:val="11"/>
+    <w:basedOn w:val="705"/>
     <w:uiPriority w:val="99"/>
     <w:pPr>
       <w:pBdr/>
@@ -12435,29 +12486,6 @@
         <w:tblBorders/>
       </w:tblPr>
       <w:tcPr>
-        <w:shd w:color="ffffff"/>
-        <w:tcBorders>
-          <w:top w:val="none" w:color="000000" w:sz="4" w:space="0"/>
-          <w:left w:val="none" w:color="000000" w:sz="4" w:space="0"/>
-          <w:bottom w:val="none" w:color="000000" w:sz="4" w:space="0"/>
-          <w:right w:val="none" w:color="000000" w:sz="4" w:space="0"/>
-        </w:tcBorders>
-      </w:tcPr>
-    </w:tblStylePr>
-    <w:tblStylePr w:type="firstRow">
-      <w:rPr>
-        <w:b/>
-        <w:color w:val="404040"/>
-      </w:rPr>
-      <w:pPr>
-        <w:pBdr/>
-        <w:spacing/>
-        <w:ind/>
-      </w:pPr>
-      <w:tblPr>
-        <w:tblBorders/>
-      </w:tblPr>
-      <w:tcPr>
         <w:shd w:val="clear" w:color="ffffff"/>
         <w:tcBorders>
           <w:top w:val="none" w:color="000000" w:sz="4" w:space="0"/>
@@ -12467,30 +12495,7 @@
         </w:tcBorders>
       </w:tcPr>
     </w:tblStylePr>
-    <w:tblStylePr w:type="lastCol">
-      <w:rPr>
-        <w:i/>
-        <w:color w:val="404040"/>
-      </w:rPr>
-      <w:pPr>
-        <w:pBdr/>
-        <w:spacing/>
-        <w:ind/>
-      </w:pPr>
-      <w:tblPr>
-        <w:tblBorders/>
-      </w:tblPr>
-      <w:tcPr>
-        <w:shd w:color="ffffff"/>
-        <w:tcBorders>
-          <w:top w:val="none" w:color="000000" w:sz="4" w:space="0"/>
-          <w:left w:val="none" w:color="000000" w:sz="4" w:space="0"/>
-          <w:bottom w:val="none" w:color="000000" w:sz="4" w:space="0"/>
-          <w:right w:val="none" w:color="000000" w:sz="4" w:space="0"/>
-        </w:tcBorders>
-      </w:tcPr>
-    </w:tblStylePr>
-    <w:tblStylePr w:type="lastRow">
+    <w:tblStylePr w:type="firstRow">
       <w:rPr>
         <w:b/>
         <w:color w:val="404040"/>
@@ -12513,6 +12518,52 @@
         </w:tcBorders>
       </w:tcPr>
     </w:tblStylePr>
+    <w:tblStylePr w:type="lastCol">
+      <w:rPr>
+        <w:i/>
+        <w:color w:val="404040"/>
+      </w:rPr>
+      <w:pPr>
+        <w:pBdr/>
+        <w:spacing/>
+        <w:ind/>
+      </w:pPr>
+      <w:tblPr>
+        <w:tblBorders/>
+      </w:tblPr>
+      <w:tcPr>
+        <w:shd w:val="clear" w:color="ffffff"/>
+        <w:tcBorders>
+          <w:top w:val="none" w:color="000000" w:sz="4" w:space="0"/>
+          <w:left w:val="none" w:color="000000" w:sz="4" w:space="0"/>
+          <w:bottom w:val="none" w:color="000000" w:sz="4" w:space="0"/>
+          <w:right w:val="none" w:color="000000" w:sz="4" w:space="0"/>
+        </w:tcBorders>
+      </w:tcPr>
+    </w:tblStylePr>
+    <w:tblStylePr w:type="lastRow">
+      <w:rPr>
+        <w:b/>
+        <w:color w:val="404040"/>
+      </w:rPr>
+      <w:pPr>
+        <w:pBdr/>
+        <w:spacing/>
+        <w:ind/>
+      </w:pPr>
+      <w:tblPr>
+        <w:tblBorders/>
+      </w:tblPr>
+      <w:tcPr>
+        <w:shd w:val="clear" w:color="ffffff"/>
+        <w:tcBorders>
+          <w:top w:val="none" w:color="000000" w:sz="4" w:space="0"/>
+          <w:left w:val="none" w:color="000000" w:sz="4" w:space="0"/>
+          <w:bottom w:val="none" w:color="000000" w:sz="4" w:space="0"/>
+          <w:right w:val="none" w:color="000000" w:sz="4" w:space="0"/>
+        </w:tcBorders>
+      </w:tcPr>
+    </w:tblStylePr>
     <w:tblStylePr w:type="nwCell">
       <w:pPr>
         <w:pBdr/>
@@ -12579,9 +12630,9 @@
       </w:tcPr>
     </w:tblStylePr>
   </w:style>
-  <w:style w:type="table" w:styleId="39">
+  <w:style w:type="table" w:styleId="733">
     <w:name w:val="Grid Table 3 - Accent 6"/>
-    <w:basedOn w:val="11"/>
+    <w:basedOn w:val="705"/>
     <w:uiPriority w:val="99"/>
     <w:pPr>
       <w:pBdr/>
@@ -12680,29 +12731,6 @@
         <w:tblBorders/>
       </w:tblPr>
       <w:tcPr>
-        <w:shd w:color="ffffff"/>
-        <w:tcBorders>
-          <w:top w:val="none" w:color="000000" w:sz="4" w:space="0"/>
-          <w:left w:val="none" w:color="000000" w:sz="4" w:space="0"/>
-          <w:bottom w:val="none" w:color="000000" w:sz="4" w:space="0"/>
-          <w:right w:val="none" w:color="000000" w:sz="4" w:space="0"/>
-        </w:tcBorders>
-      </w:tcPr>
-    </w:tblStylePr>
-    <w:tblStylePr w:type="firstRow">
-      <w:rPr>
-        <w:b/>
-        <w:color w:val="404040"/>
-      </w:rPr>
-      <w:pPr>
-        <w:pBdr/>
-        <w:spacing/>
-        <w:ind/>
-      </w:pPr>
-      <w:tblPr>
-        <w:tblBorders/>
-      </w:tblPr>
-      <w:tcPr>
         <w:shd w:val="clear" w:color="ffffff"/>
         <w:tcBorders>
           <w:top w:val="none" w:color="000000" w:sz="4" w:space="0"/>
@@ -12712,30 +12740,7 @@
         </w:tcBorders>
       </w:tcPr>
     </w:tblStylePr>
-    <w:tblStylePr w:type="lastCol">
-      <w:rPr>
-        <w:i/>
-        <w:color w:val="404040"/>
-      </w:rPr>
-      <w:pPr>
-        <w:pBdr/>
-        <w:spacing/>
-        <w:ind/>
-      </w:pPr>
-      <w:tblPr>
-        <w:tblBorders/>
-      </w:tblPr>
-      <w:tcPr>
-        <w:shd w:color="ffffff"/>
-        <w:tcBorders>
-          <w:top w:val="none" w:color="000000" w:sz="4" w:space="0"/>
-          <w:left w:val="none" w:color="000000" w:sz="4" w:space="0"/>
-          <w:bottom w:val="none" w:color="000000" w:sz="4" w:space="0"/>
-          <w:right w:val="none" w:color="000000" w:sz="4" w:space="0"/>
-        </w:tcBorders>
-      </w:tcPr>
-    </w:tblStylePr>
-    <w:tblStylePr w:type="lastRow">
+    <w:tblStylePr w:type="firstRow">
       <w:rPr>
         <w:b/>
         <w:color w:val="404040"/>
@@ -12758,6 +12763,52 @@
         </w:tcBorders>
       </w:tcPr>
     </w:tblStylePr>
+    <w:tblStylePr w:type="lastCol">
+      <w:rPr>
+        <w:i/>
+        <w:color w:val="404040"/>
+      </w:rPr>
+      <w:pPr>
+        <w:pBdr/>
+        <w:spacing/>
+        <w:ind/>
+      </w:pPr>
+      <w:tblPr>
+        <w:tblBorders/>
+      </w:tblPr>
+      <w:tcPr>
+        <w:shd w:val="clear" w:color="ffffff"/>
+        <w:tcBorders>
+          <w:top w:val="none" w:color="000000" w:sz="4" w:space="0"/>
+          <w:left w:val="none" w:color="000000" w:sz="4" w:space="0"/>
+          <w:bottom w:val="none" w:color="000000" w:sz="4" w:space="0"/>
+          <w:right w:val="none" w:color="000000" w:sz="4" w:space="0"/>
+        </w:tcBorders>
+      </w:tcPr>
+    </w:tblStylePr>
+    <w:tblStylePr w:type="lastRow">
+      <w:rPr>
+        <w:b/>
+        <w:color w:val="404040"/>
+      </w:rPr>
+      <w:pPr>
+        <w:pBdr/>
+        <w:spacing/>
+        <w:ind/>
+      </w:pPr>
+      <w:tblPr>
+        <w:tblBorders/>
+      </w:tblPr>
+      <w:tcPr>
+        <w:shd w:val="clear" w:color="ffffff"/>
+        <w:tcBorders>
+          <w:top w:val="none" w:color="000000" w:sz="4" w:space="0"/>
+          <w:left w:val="none" w:color="000000" w:sz="4" w:space="0"/>
+          <w:bottom w:val="none" w:color="000000" w:sz="4" w:space="0"/>
+          <w:right w:val="none" w:color="000000" w:sz="4" w:space="0"/>
+        </w:tcBorders>
+      </w:tcPr>
+    </w:tblStylePr>
     <w:tblStylePr w:type="nwCell">
       <w:pPr>
         <w:pBdr/>
@@ -12824,9 +12875,9 @@
       </w:tcPr>
     </w:tblStylePr>
   </w:style>
-  <w:style w:type="table" w:styleId="40">
+  <w:style w:type="table" w:styleId="734">
     <w:name w:val="Grid Table 4"/>
-    <w:basedOn w:val="11"/>
+    <w:basedOn w:val="705"/>
     <w:uiPriority w:val="59"/>
     <w:pPr>
       <w:pBdr/>
@@ -13057,9 +13108,9 @@
       </w:tcPr>
     </w:tblStylePr>
   </w:style>
-  <w:style w:type="table" w:styleId="41">
+  <w:style w:type="table" w:styleId="735">
     <w:name w:val="Grid Table 4 - Accent 1"/>
-    <w:basedOn w:val="11"/>
+    <w:basedOn w:val="705"/>
     <w:uiPriority w:val="59"/>
     <w:pPr>
       <w:pBdr/>
@@ -13290,9 +13341,9 @@
       </w:tcPr>
     </w:tblStylePr>
   </w:style>
-  <w:style w:type="table" w:styleId="42">
+  <w:style w:type="table" w:styleId="736">
     <w:name w:val="Grid Table 4 - Accent 2"/>
-    <w:basedOn w:val="11"/>
+    <w:basedOn w:val="705"/>
     <w:uiPriority w:val="59"/>
     <w:pPr>
       <w:pBdr/>
@@ -13523,9 +13574,9 @@
       </w:tcPr>
     </w:tblStylePr>
   </w:style>
-  <w:style w:type="table" w:styleId="43">
+  <w:style w:type="table" w:styleId="737">
     <w:name w:val="Grid Table 4 - Accent 3"/>
-    <w:basedOn w:val="11"/>
+    <w:basedOn w:val="705"/>
     <w:uiPriority w:val="59"/>
     <w:pPr>
       <w:pBdr/>
@@ -13756,9 +13807,9 @@
       </w:tcPr>
     </w:tblStylePr>
   </w:style>
-  <w:style w:type="table" w:styleId="44">
+  <w:style w:type="table" w:styleId="738">
     <w:name w:val="Grid Table 4 - Accent 4"/>
-    <w:basedOn w:val="11"/>
+    <w:basedOn w:val="705"/>
     <w:uiPriority w:val="59"/>
     <w:pPr>
       <w:pBdr/>
@@ -13989,9 +14040,9 @@
       </w:tcPr>
     </w:tblStylePr>
   </w:style>
-  <w:style w:type="table" w:styleId="45">
+  <w:style w:type="table" w:styleId="739">
     <w:name w:val="Grid Table 4 - Accent 5"/>
-    <w:basedOn w:val="11"/>
+    <w:basedOn w:val="705"/>
     <w:uiPriority w:val="59"/>
     <w:pPr>
       <w:pBdr/>
@@ -14222,9 +14273,9 @@
       </w:tcPr>
     </w:tblStylePr>
   </w:style>
-  <w:style w:type="table" w:styleId="46">
+  <w:style w:type="table" w:styleId="740">
     <w:name w:val="Grid Table 4 - Accent 6"/>
-    <w:basedOn w:val="11"/>
+    <w:basedOn w:val="705"/>
     <w:uiPriority w:val="59"/>
     <w:pPr>
       <w:pBdr/>
@@ -14455,9 +14506,9 @@
       </w:tcPr>
     </w:tblStylePr>
   </w:style>
-  <w:style w:type="table" w:styleId="47">
+  <w:style w:type="table" w:styleId="741">
     <w:name w:val="Grid Table 5 Dark"/>
-    <w:basedOn w:val="11"/>
+    <w:basedOn w:val="705"/>
     <w:uiPriority w:val="99"/>
     <w:pPr>
       <w:pBdr/>
@@ -14683,9 +14734,9 @@
       </w:tcPr>
     </w:tblStylePr>
   </w:style>
-  <w:style w:type="table" w:styleId="48">
+  <w:style w:type="table" w:styleId="742">
     <w:name w:val="Grid Table 5 Dark- Accent 1"/>
-    <w:basedOn w:val="11"/>
+    <w:basedOn w:val="705"/>
     <w:uiPriority w:val="99"/>
     <w:pPr>
       <w:pBdr/>
@@ -14911,9 +14962,9 @@
       </w:tcPr>
     </w:tblStylePr>
   </w:style>
-  <w:style w:type="table" w:styleId="49">
+  <w:style w:type="table" w:styleId="743">
     <w:name w:val="Grid Table 5 Dark - Accent 2"/>
-    <w:basedOn w:val="11"/>
+    <w:basedOn w:val="705"/>
     <w:uiPriority w:val="99"/>
     <w:pPr>
       <w:pBdr/>
@@ -15139,9 +15190,9 @@
       </w:tcPr>
     </w:tblStylePr>
   </w:style>
-  <w:style w:type="table" w:styleId="50">
+  <w:style w:type="table" w:styleId="744">
     <w:name w:val="Grid Table 5 Dark - Accent 3"/>
-    <w:basedOn w:val="11"/>
+    <w:basedOn w:val="705"/>
     <w:uiPriority w:val="99"/>
     <w:pPr>
       <w:pBdr/>
@@ -15367,9 +15418,9 @@
       </w:tcPr>
     </w:tblStylePr>
   </w:style>
-  <w:style w:type="table" w:styleId="51">
+  <w:style w:type="table" w:styleId="745">
     <w:name w:val="Grid Table 5 Dark- Accent 4"/>
-    <w:basedOn w:val="11"/>
+    <w:basedOn w:val="705"/>
     <w:uiPriority w:val="99"/>
     <w:pPr>
       <w:pBdr/>
@@ -15595,9 +15646,9 @@
       </w:tcPr>
     </w:tblStylePr>
   </w:style>
-  <w:style w:type="table" w:styleId="52">
+  <w:style w:type="table" w:styleId="746">
     <w:name w:val="Grid Table 5 Dark - Accent 5"/>
-    <w:basedOn w:val="11"/>
+    <w:basedOn w:val="705"/>
     <w:uiPriority w:val="99"/>
     <w:pPr>
       <w:pBdr/>
@@ -15823,9 +15874,9 @@
       </w:tcPr>
     </w:tblStylePr>
   </w:style>
-  <w:style w:type="table" w:styleId="53">
+  <w:style w:type="table" w:styleId="747">
     <w:name w:val="Grid Table 5 Dark - Accent 6"/>
-    <w:basedOn w:val="11"/>
+    <w:basedOn w:val="705"/>
     <w:uiPriority w:val="99"/>
     <w:pPr>
       <w:pBdr/>
@@ -16051,9 +16102,9 @@
       </w:tcPr>
     </w:tblStylePr>
   </w:style>
-  <w:style w:type="table" w:styleId="54">
+  <w:style w:type="table" w:styleId="748">
     <w:name w:val="Grid Table 6 Colorful"/>
-    <w:basedOn w:val="11"/>
+    <w:basedOn w:val="705"/>
     <w:uiPriority w:val="99"/>
     <w:pPr>
       <w:pBdr/>
@@ -16281,9 +16332,9 @@
       </w:tcPr>
     </w:tblStylePr>
   </w:style>
-  <w:style w:type="table" w:styleId="55">
+  <w:style w:type="table" w:styleId="749">
     <w:name w:val="Grid Table 6 Colorful - Accent 1"/>
-    <w:basedOn w:val="11"/>
+    <w:basedOn w:val="705"/>
     <w:uiPriority w:val="99"/>
     <w:pPr>
       <w:pBdr/>
@@ -16511,9 +16562,9 @@
       </w:tcPr>
     </w:tblStylePr>
   </w:style>
-  <w:style w:type="table" w:styleId="56">
+  <w:style w:type="table" w:styleId="750">
     <w:name w:val="Grid Table 6 Colorful - Accent 2"/>
-    <w:basedOn w:val="11"/>
+    <w:basedOn w:val="705"/>
     <w:uiPriority w:val="99"/>
     <w:pPr>
       <w:pBdr/>
@@ -16741,9 +16792,9 @@
       </w:tcPr>
     </w:tblStylePr>
   </w:style>
-  <w:style w:type="table" w:styleId="57">
+  <w:style w:type="table" w:styleId="751">
     <w:name w:val="Grid Table 6 Colorful - Accent 3"/>
-    <w:basedOn w:val="11"/>
+    <w:basedOn w:val="705"/>
     <w:uiPriority w:val="99"/>
     <w:pPr>
       <w:pBdr/>
@@ -16971,9 +17022,9 @@
       </w:tcPr>
     </w:tblStylePr>
   </w:style>
-  <w:style w:type="table" w:styleId="58">
+  <w:style w:type="table" w:styleId="752">
     <w:name w:val="Grid Table 6 Colorful - Accent 4"/>
-    <w:basedOn w:val="11"/>
+    <w:basedOn w:val="705"/>
     <w:uiPriority w:val="99"/>
     <w:pPr>
       <w:pBdr/>
@@ -17201,9 +17252,9 @@
       </w:tcPr>
     </w:tblStylePr>
   </w:style>
-  <w:style w:type="table" w:styleId="59">
+  <w:style w:type="table" w:styleId="753">
     <w:name w:val="Grid Table 6 Colorful - Accent 5"/>
-    <w:basedOn w:val="11"/>
+    <w:basedOn w:val="705"/>
     <w:uiPriority w:val="99"/>
     <w:pPr>
       <w:pBdr/>
@@ -17431,9 +17482,9 @@
       </w:tcPr>
     </w:tblStylePr>
   </w:style>
-  <w:style w:type="table" w:styleId="60">
+  <w:style w:type="table" w:styleId="754">
     <w:name w:val="Grid Table 6 Colorful - Accent 6"/>
-    <w:basedOn w:val="11"/>
+    <w:basedOn w:val="705"/>
     <w:uiPriority w:val="99"/>
     <w:pPr>
       <w:pBdr/>
@@ -17661,9 +17712,9 @@
       </w:tcPr>
     </w:tblStylePr>
   </w:style>
-  <w:style w:type="table" w:styleId="61">
+  <w:style w:type="table" w:styleId="755">
     <w:name w:val="Grid Table 7 Colorful"/>
-    <w:basedOn w:val="11"/>
+    <w:basedOn w:val="705"/>
     <w:uiPriority w:val="99"/>
     <w:pPr>
       <w:pBdr/>
@@ -17765,11 +17816,11 @@
         <w:tblBorders/>
       </w:tblPr>
       <w:tcPr>
-        <w:shd w:color="ffffff"/>
+        <w:shd w:val="clear" w:color="ffffff"/>
         <w:tcBorders>
-          <w:top w:val="none"/>
-          <w:left w:val="none"/>
-          <w:bottom w:val="none"/>
+          <w:top w:val="none" w:color="000000" w:sz="4" w:space="0"/>
+          <w:left w:val="none" w:color="000000" w:sz="4" w:space="0"/>
+          <w:bottom w:val="none" w:color="000000" w:sz="4" w:space="0"/>
           <w:right w:val="single" w:color="000000" w:themeColor="text1" w:themeTint="80" w:sz="4" w:space="0"/>
         </w:tcBorders>
       </w:tcPr>
@@ -17792,10 +17843,10 @@
       <w:tcPr>
         <w:shd w:val="clear" w:color="ffffff" w:themeColor="light1" w:fill="ffffff" w:themeFill="light1"/>
         <w:tcBorders>
-          <w:top w:val="none"/>
-          <w:left w:val="none"/>
+          <w:top w:val="none" w:color="000000" w:sz="4" w:space="0"/>
+          <w:left w:val="none" w:color="000000" w:sz="4" w:space="0"/>
           <w:bottom w:val="single" w:color="000000" w:themeColor="text1" w:themeTint="80" w:sz="4" w:space="0"/>
-          <w:right w:val="none"/>
+          <w:right w:val="none" w:color="000000" w:sz="4" w:space="0"/>
         </w:tcBorders>
       </w:tcPr>
     </w:tblStylePr>
@@ -17815,12 +17866,12 @@
         <w:tblBorders/>
       </w:tblPr>
       <w:tcPr>
-        <w:shd w:color="ffffff"/>
+        <w:shd w:val="clear" w:color="ffffff"/>
         <w:tcBorders>
-          <w:top w:val="none"/>
+          <w:top w:val="none" w:color="000000" w:sz="4" w:space="0"/>
           <w:left w:val="single" w:color="000000" w:themeColor="text1" w:themeTint="80" w:sz="4" w:space="0"/>
-          <w:bottom w:val="none"/>
-          <w:right w:val="none"/>
+          <w:bottom w:val="none" w:color="000000" w:sz="4" w:space="0"/>
+          <w:right w:val="none" w:color="000000" w:sz="4" w:space="0"/>
         </w:tcBorders>
       </w:tcPr>
     </w:tblStylePr>
@@ -17843,9 +17894,9 @@
         <w:shd w:val="clear" w:color="ffffff" w:themeColor="light1" w:fill="ffffff" w:themeFill="light1"/>
         <w:tcBorders>
           <w:top w:val="single" w:color="000000" w:themeColor="text1" w:themeTint="80" w:sz="4" w:space="0"/>
-          <w:left w:val="none"/>
-          <w:bottom w:val="none"/>
-          <w:right w:val="none"/>
+          <w:left w:val="none" w:color="000000" w:sz="4" w:space="0"/>
+          <w:bottom w:val="none" w:color="000000" w:sz="4" w:space="0"/>
+          <w:right w:val="none" w:color="000000" w:sz="4" w:space="0"/>
         </w:tcBorders>
       </w:tcPr>
     </w:tblStylePr>
@@ -17915,9 +17966,9 @@
       </w:tcPr>
     </w:tblStylePr>
   </w:style>
-  <w:style w:type="table" w:styleId="62">
+  <w:style w:type="table" w:styleId="756">
     <w:name w:val="Grid Table 7 Colorful - Accent 1"/>
-    <w:basedOn w:val="11"/>
+    <w:basedOn w:val="705"/>
     <w:uiPriority w:val="99"/>
     <w:pPr>
       <w:pBdr/>
@@ -18019,11 +18070,11 @@
         <w:tblBorders/>
       </w:tblPr>
       <w:tcPr>
-        <w:shd w:color="ffffff"/>
+        <w:shd w:val="clear" w:color="ffffff"/>
         <w:tcBorders>
-          <w:top w:val="none"/>
-          <w:left w:val="none"/>
-          <w:bottom w:val="none"/>
+          <w:top w:val="none" w:color="000000" w:sz="4" w:space="0"/>
+          <w:left w:val="none" w:color="000000" w:sz="4" w:space="0"/>
+          <w:bottom w:val="none" w:color="000000" w:sz="4" w:space="0"/>
           <w:right w:val="single" w:color="000000" w:themeColor="accent1" w:themeTint="80" w:sz="4" w:space="0"/>
         </w:tcBorders>
       </w:tcPr>
@@ -18046,10 +18097,10 @@
       <w:tcPr>
         <w:shd w:val="clear" w:color="ffffff" w:themeColor="light1" w:fill="ffffff" w:themeFill="light1"/>
         <w:tcBorders>
-          <w:top w:val="none"/>
-          <w:left w:val="none"/>
+          <w:top w:val="none" w:color="000000" w:sz="4" w:space="0"/>
+          <w:left w:val="none" w:color="000000" w:sz="4" w:space="0"/>
           <w:bottom w:val="single" w:color="000000" w:themeColor="accent1" w:themeTint="80" w:sz="4" w:space="0"/>
-          <w:right w:val="none"/>
+          <w:right w:val="none" w:color="000000" w:sz="4" w:space="0"/>
         </w:tcBorders>
       </w:tcPr>
     </w:tblStylePr>
@@ -18069,12 +18120,12 @@
         <w:tblBorders/>
       </w:tblPr>
       <w:tcPr>
-        <w:shd w:color="ffffff"/>
+        <w:shd w:val="clear" w:color="ffffff"/>
         <w:tcBorders>
-          <w:top w:val="none"/>
+          <w:top w:val="none" w:color="000000" w:sz="4" w:space="0"/>
           <w:left w:val="single" w:color="000000" w:themeColor="accent1" w:themeTint="80" w:sz="4" w:space="0"/>
-          <w:bottom w:val="none"/>
-          <w:right w:val="none"/>
+          <w:bottom w:val="none" w:color="000000" w:sz="4" w:space="0"/>
+          <w:right w:val="none" w:color="000000" w:sz="4" w:space="0"/>
         </w:tcBorders>
       </w:tcPr>
     </w:tblStylePr>
@@ -18097,9 +18148,9 @@
         <w:shd w:val="clear" w:color="ffffff" w:themeColor="light1" w:fill="ffffff" w:themeFill="light1"/>
         <w:tcBorders>
           <w:top w:val="single" w:color="000000" w:themeColor="accent1" w:themeTint="80" w:sz="4" w:space="0"/>
-          <w:left w:val="none"/>
-          <w:bottom w:val="none"/>
-          <w:right w:val="none"/>
+          <w:left w:val="none" w:color="000000" w:sz="4" w:space="0"/>
+          <w:bottom w:val="none" w:color="000000" w:sz="4" w:space="0"/>
+          <w:right w:val="none" w:color="000000" w:sz="4" w:space="0"/>
         </w:tcBorders>
       </w:tcPr>
     </w:tblStylePr>
@@ -18169,9 +18220,9 @@
       </w:tcPr>
     </w:tblStylePr>
   </w:style>
-  <w:style w:type="table" w:styleId="63">
+  <w:style w:type="table" w:styleId="757">
     <w:name w:val="Grid Table 7 Colorful - Accent 2"/>
-    <w:basedOn w:val="11"/>
+    <w:basedOn w:val="705"/>
     <w:uiPriority w:val="99"/>
     <w:pPr>
       <w:pBdr/>
@@ -18273,11 +18324,11 @@
         <w:tblBorders/>
       </w:tblPr>
       <w:tcPr>
-        <w:shd w:color="ffffff"/>
+        <w:shd w:val="clear" w:color="ffffff"/>
         <w:tcBorders>
-          <w:top w:val="none"/>
-          <w:left w:val="none"/>
-          <w:bottom w:val="none"/>
+          <w:top w:val="none" w:color="000000" w:sz="4" w:space="0"/>
+          <w:left w:val="none" w:color="000000" w:sz="4" w:space="0"/>
+          <w:bottom w:val="none" w:color="000000" w:sz="4" w:space="0"/>
           <w:right w:val="single" w:color="000000" w:themeColor="accent2" w:themeTint="97" w:sz="4" w:space="0"/>
         </w:tcBorders>
       </w:tcPr>
@@ -18300,10 +18351,10 @@
       <w:tcPr>
         <w:shd w:val="clear" w:color="ffffff" w:themeColor="light1" w:fill="ffffff" w:themeFill="light1"/>
         <w:tcBorders>
-          <w:top w:val="none"/>
-          <w:left w:val="none"/>
+          <w:top w:val="none" w:color="000000" w:sz="4" w:space="0"/>
+          <w:left w:val="none" w:color="000000" w:sz="4" w:space="0"/>
           <w:bottom w:val="single" w:color="000000" w:themeColor="accent2" w:themeTint="97" w:sz="4" w:space="0"/>
-          <w:right w:val="none"/>
+          <w:right w:val="none" w:color="000000" w:sz="4" w:space="0"/>
         </w:tcBorders>
       </w:tcPr>
     </w:tblStylePr>
@@ -18323,12 +18374,12 @@
         <w:tblBorders/>
       </w:tblPr>
       <w:tcPr>
-        <w:shd w:color="ffffff"/>
+        <w:shd w:val="clear" w:color="ffffff"/>
         <w:tcBorders>
-          <w:top w:val="none"/>
+          <w:top w:val="none" w:color="000000" w:sz="4" w:space="0"/>
           <w:left w:val="single" w:color="000000" w:themeColor="accent2" w:themeTint="97" w:sz="4" w:space="0"/>
-          <w:bottom w:val="none"/>
-          <w:right w:val="none"/>
+          <w:bottom w:val="none" w:color="000000" w:sz="4" w:space="0"/>
+          <w:right w:val="none" w:color="000000" w:sz="4" w:space="0"/>
         </w:tcBorders>
       </w:tcPr>
     </w:tblStylePr>
@@ -18351,9 +18402,9 @@
         <w:shd w:val="clear" w:color="ffffff" w:themeColor="light1" w:fill="ffffff" w:themeFill="light1"/>
         <w:tcBorders>
           <w:top w:val="single" w:color="000000" w:themeColor="accent2" w:themeTint="97" w:sz="4" w:space="0"/>
-          <w:left w:val="none"/>
-          <w:bottom w:val="none"/>
-          <w:right w:val="none"/>
+          <w:left w:val="none" w:color="000000" w:sz="4" w:space="0"/>
+          <w:bottom w:val="none" w:color="000000" w:sz="4" w:space="0"/>
+          <w:right w:val="none" w:color="000000" w:sz="4" w:space="0"/>
         </w:tcBorders>
       </w:tcPr>
     </w:tblStylePr>
@@ -18423,9 +18474,9 @@
       </w:tcPr>
     </w:tblStylePr>
   </w:style>
-  <w:style w:type="table" w:styleId="64">
+  <w:style w:type="table" w:styleId="758">
     <w:name w:val="Grid Table 7 Colorful - Accent 3"/>
-    <w:basedOn w:val="11"/>
+    <w:basedOn w:val="705"/>
     <w:uiPriority w:val="99"/>
     <w:pPr>
       <w:pBdr/>
@@ -18527,11 +18578,11 @@
         <w:tblBorders/>
       </w:tblPr>
       <w:tcPr>
-        <w:shd w:color="ffffff"/>
+        <w:shd w:val="clear" w:color="ffffff"/>
         <w:tcBorders>
-          <w:top w:val="none"/>
-          <w:left w:val="none"/>
-          <w:bottom w:val="none"/>
+          <w:top w:val="none" w:color="000000" w:sz="4" w:space="0"/>
+          <w:left w:val="none" w:color="000000" w:sz="4" w:space="0"/>
+          <w:bottom w:val="none" w:color="000000" w:sz="4" w:space="0"/>
           <w:right w:val="single" w:color="000000" w:themeColor="accent3" w:themeTint="FE" w:sz="4" w:space="0"/>
         </w:tcBorders>
       </w:tcPr>
@@ -18554,10 +18605,10 @@
       <w:tcPr>
         <w:shd w:val="clear" w:color="ffffff" w:themeColor="light1" w:fill="ffffff" w:themeFill="light1"/>
         <w:tcBorders>
-          <w:top w:val="none"/>
-          <w:left w:val="none"/>
+          <w:top w:val="none" w:color="000000" w:sz="4" w:space="0"/>
+          <w:left w:val="none" w:color="000000" w:sz="4" w:space="0"/>
           <w:bottom w:val="single" w:color="000000" w:themeColor="accent3" w:themeTint="FE" w:sz="4" w:space="0"/>
-          <w:right w:val="none"/>
+          <w:right w:val="none" w:color="000000" w:sz="4" w:space="0"/>
         </w:tcBorders>
       </w:tcPr>
     </w:tblStylePr>
@@ -18577,12 +18628,12 @@
         <w:tblBorders/>
       </w:tblPr>
       <w:tcPr>
-        <w:shd w:color="ffffff"/>
+        <w:shd w:val="clear" w:color="ffffff"/>
         <w:tcBorders>
-          <w:top w:val="none"/>
+          <w:top w:val="none" w:color="000000" w:sz="4" w:space="0"/>
           <w:left w:val="single" w:color="000000" w:themeColor="accent3" w:themeTint="FE" w:sz="4" w:space="0"/>
-          <w:bottom w:val="none"/>
-          <w:right w:val="none"/>
+          <w:bottom w:val="none" w:color="000000" w:sz="4" w:space="0"/>
+          <w:right w:val="none" w:color="000000" w:sz="4" w:space="0"/>
         </w:tcBorders>
       </w:tcPr>
     </w:tblStylePr>
@@ -18605,9 +18656,9 @@
         <w:shd w:val="clear" w:color="ffffff" w:themeColor="light1" w:fill="ffffff" w:themeFill="light1"/>
         <w:tcBorders>
           <w:top w:val="single" w:color="000000" w:themeColor="accent3" w:themeTint="FE" w:sz="4" w:space="0"/>
-          <w:left w:val="none"/>
-          <w:bottom w:val="none"/>
-          <w:right w:val="none"/>
+          <w:left w:val="none" w:color="000000" w:sz="4" w:space="0"/>
+          <w:bottom w:val="none" w:color="000000" w:sz="4" w:space="0"/>
+          <w:right w:val="none" w:color="000000" w:sz="4" w:space="0"/>
         </w:tcBorders>
       </w:tcPr>
     </w:tblStylePr>
@@ -18677,9 +18728,9 @@
       </w:tcPr>
     </w:tblStylePr>
   </w:style>
-  <w:style w:type="table" w:styleId="65">
+  <w:style w:type="table" w:styleId="759">
     <w:name w:val="Grid Table 7 Colorful - Accent 4"/>
-    <w:basedOn w:val="11"/>
+    <w:basedOn w:val="705"/>
     <w:uiPriority w:val="99"/>
     <w:pPr>
       <w:pBdr/>
@@ -18781,11 +18832,11 @@
         <w:tblBorders/>
       </w:tblPr>
       <w:tcPr>
-        <w:shd w:color="ffffff"/>
+        <w:shd w:val="clear" w:color="ffffff"/>
         <w:tcBorders>
-          <w:top w:val="none"/>
-          <w:left w:val="none"/>
-          <w:bottom w:val="none"/>
+          <w:top w:val="none" w:color="000000" w:sz="4" w:space="0"/>
+          <w:left w:val="none" w:color="000000" w:sz="4" w:space="0"/>
+          <w:bottom w:val="none" w:color="000000" w:sz="4" w:space="0"/>
           <w:right w:val="single" w:color="000000" w:themeColor="accent4" w:themeTint="9A" w:sz="4" w:space="0"/>
         </w:tcBorders>
       </w:tcPr>
@@ -18808,10 +18859,10 @@
       <w:tcPr>
         <w:shd w:val="clear" w:color="ffffff" w:themeColor="light1" w:fill="ffffff" w:themeFill="light1"/>
         <w:tcBorders>
-          <w:top w:val="none"/>
-          <w:left w:val="none"/>
+          <w:top w:val="none" w:color="000000" w:sz="4" w:space="0"/>
+          <w:left w:val="none" w:color="000000" w:sz="4" w:space="0"/>
           <w:bottom w:val="single" w:color="000000" w:themeColor="accent4" w:themeTint="9A" w:sz="4" w:space="0"/>
-          <w:right w:val="none"/>
+          <w:right w:val="none" w:color="000000" w:sz="4" w:space="0"/>
         </w:tcBorders>
       </w:tcPr>
     </w:tblStylePr>
@@ -18831,12 +18882,12 @@
         <w:tblBorders/>
       </w:tblPr>
       <w:tcPr>
-        <w:shd w:color="ffffff"/>
+        <w:shd w:val="clear" w:color="ffffff"/>
         <w:tcBorders>
-          <w:top w:val="none"/>
+          <w:top w:val="none" w:color="000000" w:sz="4" w:space="0"/>
           <w:left w:val="single" w:color="000000" w:themeColor="accent4" w:themeTint="9A" w:sz="4" w:space="0"/>
-          <w:bottom w:val="none"/>
-          <w:right w:val="none"/>
+          <w:bottom w:val="none" w:color="000000" w:sz="4" w:space="0"/>
+          <w:right w:val="none" w:color="000000" w:sz="4" w:space="0"/>
         </w:tcBorders>
       </w:tcPr>
     </w:tblStylePr>
@@ -18859,9 +18910,9 @@
         <w:shd w:val="clear" w:color="ffffff" w:themeColor="light1" w:fill="ffffff" w:themeFill="light1"/>
         <w:tcBorders>
           <w:top w:val="single" w:color="000000" w:themeColor="accent4" w:themeTint="9A" w:sz="4" w:space="0"/>
-          <w:left w:val="none"/>
-          <w:bottom w:val="none"/>
-          <w:right w:val="none"/>
+          <w:left w:val="none" w:color="000000" w:sz="4" w:space="0"/>
+          <w:bottom w:val="none" w:color="000000" w:sz="4" w:space="0"/>
+          <w:right w:val="none" w:color="000000" w:sz="4" w:space="0"/>
         </w:tcBorders>
       </w:tcPr>
     </w:tblStylePr>
@@ -18931,9 +18982,9 @@
       </w:tcPr>
     </w:tblStylePr>
   </w:style>
-  <w:style w:type="table" w:styleId="66">
+  <w:style w:type="table" w:styleId="760">
     <w:name w:val="Grid Table 7 Colorful - Accent 5"/>
-    <w:basedOn w:val="11"/>
+    <w:basedOn w:val="705"/>
     <w:uiPriority w:val="99"/>
     <w:pPr>
       <w:pBdr/>
@@ -19035,11 +19086,11 @@
         <w:tblBorders/>
       </w:tblPr>
       <w:tcPr>
-        <w:shd w:color="ffffff"/>
+        <w:shd w:val="clear" w:color="ffffff"/>
         <w:tcBorders>
-          <w:top w:val="none"/>
-          <w:left w:val="none"/>
-          <w:bottom w:val="none"/>
+          <w:top w:val="none" w:color="000000" w:sz="4" w:space="0"/>
+          <w:left w:val="none" w:color="000000" w:sz="4" w:space="0"/>
+          <w:bottom w:val="none" w:color="000000" w:sz="4" w:space="0"/>
           <w:right w:val="single" w:color="000000" w:themeColor="accent5" w:themeTint="90" w:sz="4" w:space="0"/>
         </w:tcBorders>
       </w:tcPr>
@@ -19062,10 +19113,10 @@
       <w:tcPr>
         <w:shd w:val="clear" w:color="ffffff" w:themeColor="light1" w:fill="ffffff" w:themeFill="light1"/>
         <w:tcBorders>
-          <w:top w:val="none"/>
-          <w:left w:val="none"/>
+          <w:top w:val="none" w:color="000000" w:sz="4" w:space="0"/>
+          <w:left w:val="none" w:color="000000" w:sz="4" w:space="0"/>
           <w:bottom w:val="single" w:color="000000" w:themeColor="accent5" w:themeTint="90" w:sz="4" w:space="0"/>
-          <w:right w:val="none"/>
+          <w:right w:val="none" w:color="000000" w:sz="4" w:space="0"/>
         </w:tcBorders>
       </w:tcPr>
     </w:tblStylePr>
@@ -19085,12 +19136,12 @@
         <w:tblBorders/>
       </w:tblPr>
       <w:tcPr>
-        <w:shd w:color="ffffff"/>
+        <w:shd w:val="clear" w:color="ffffff"/>
         <w:tcBorders>
-          <w:top w:val="none"/>
+          <w:top w:val="none" w:color="000000" w:sz="4" w:space="0"/>
           <w:left w:val="single" w:color="000000" w:themeColor="accent5" w:themeTint="90" w:sz="4" w:space="0"/>
-          <w:bottom w:val="none"/>
-          <w:right w:val="none"/>
+          <w:bottom w:val="none" w:color="000000" w:sz="4" w:space="0"/>
+          <w:right w:val="none" w:color="000000" w:sz="4" w:space="0"/>
         </w:tcBorders>
       </w:tcPr>
     </w:tblStylePr>
@@ -19113,9 +19164,9 @@
         <w:shd w:val="clear" w:color="ffffff" w:themeColor="light1" w:fill="ffffff" w:themeFill="light1"/>
         <w:tcBorders>
           <w:top w:val="single" w:color="000000" w:themeColor="accent5" w:themeTint="90" w:sz="4" w:space="0"/>
-          <w:left w:val="none"/>
-          <w:bottom w:val="none"/>
-          <w:right w:val="none"/>
+          <w:left w:val="none" w:color="000000" w:sz="4" w:space="0"/>
+          <w:bottom w:val="none" w:color="000000" w:sz="4" w:space="0"/>
+          <w:right w:val="none" w:color="000000" w:sz="4" w:space="0"/>
         </w:tcBorders>
       </w:tcPr>
     </w:tblStylePr>
@@ -19185,9 +19236,9 @@
       </w:tcPr>
     </w:tblStylePr>
   </w:style>
-  <w:style w:type="table" w:styleId="67">
+  <w:style w:type="table" w:styleId="761">
     <w:name w:val="Grid Table 7 Colorful - Accent 6"/>
-    <w:basedOn w:val="11"/>
+    <w:basedOn w:val="705"/>
     <w:uiPriority w:val="99"/>
     <w:pPr>
       <w:pBdr/>
@@ -19289,11 +19340,11 @@
         <w:tblBorders/>
       </w:tblPr>
       <w:tcPr>
-        <w:shd w:color="ffffff"/>
+        <w:shd w:val="clear" w:color="ffffff"/>
         <w:tcBorders>
-          <w:top w:val="none"/>
-          <w:left w:val="none"/>
-          <w:bottom w:val="none"/>
+          <w:top w:val="none" w:color="000000" w:sz="4" w:space="0"/>
+          <w:left w:val="none" w:color="000000" w:sz="4" w:space="0"/>
+          <w:bottom w:val="none" w:color="000000" w:sz="4" w:space="0"/>
           <w:right w:val="single" w:color="000000" w:themeColor="accent6" w:themeTint="90" w:sz="4" w:space="0"/>
         </w:tcBorders>
       </w:tcPr>
@@ -19316,10 +19367,10 @@
       <w:tcPr>
         <w:shd w:val="clear" w:color="ffffff" w:themeColor="light1" w:fill="ffffff" w:themeFill="light1"/>
         <w:tcBorders>
-          <w:top w:val="none"/>
-          <w:left w:val="none"/>
+          <w:top w:val="none" w:color="000000" w:sz="4" w:space="0"/>
+          <w:left w:val="none" w:color="000000" w:sz="4" w:space="0"/>
           <w:bottom w:val="single" w:color="000000" w:themeColor="accent6" w:themeTint="90" w:sz="4" w:space="0"/>
-          <w:right w:val="none"/>
+          <w:right w:val="none" w:color="000000" w:sz="4" w:space="0"/>
         </w:tcBorders>
       </w:tcPr>
     </w:tblStylePr>
@@ -19339,12 +19390,12 @@
         <w:tblBorders/>
       </w:tblPr>
       <w:tcPr>
-        <w:shd w:color="ffffff"/>
+        <w:shd w:val="clear" w:color="ffffff"/>
         <w:tcBorders>
-          <w:top w:val="none"/>
+          <w:top w:val="none" w:color="000000" w:sz="4" w:space="0"/>
           <w:left w:val="single" w:color="000000" w:themeColor="accent6" w:themeTint="90" w:sz="4" w:space="0"/>
-          <w:bottom w:val="none"/>
-          <w:right w:val="none"/>
+          <w:bottom w:val="none" w:color="000000" w:sz="4" w:space="0"/>
+          <w:right w:val="none" w:color="000000" w:sz="4" w:space="0"/>
         </w:tcBorders>
       </w:tcPr>
     </w:tblStylePr>
@@ -19367,9 +19418,9 @@
         <w:shd w:val="clear" w:color="ffffff" w:themeColor="light1" w:fill="ffffff" w:themeFill="light1"/>
         <w:tcBorders>
           <w:top w:val="single" w:color="000000" w:themeColor="accent6" w:themeTint="90" w:sz="4" w:space="0"/>
-          <w:left w:val="none"/>
-          <w:bottom w:val="none"/>
-          <w:right w:val="none"/>
+          <w:left w:val="none" w:color="000000" w:sz="4" w:space="0"/>
+          <w:bottom w:val="none" w:color="000000" w:sz="4" w:space="0"/>
+          <w:right w:val="none" w:color="000000" w:sz="4" w:space="0"/>
         </w:tcBorders>
       </w:tcPr>
     </w:tblStylePr>
@@ -19439,9 +19490,9 @@
       </w:tcPr>
     </w:tblStylePr>
   </w:style>
-  <w:style w:type="table" w:styleId="68">
+  <w:style w:type="table" w:styleId="762">
     <w:name w:val="List Table 1 Light"/>
-    <w:basedOn w:val="11"/>
+    <w:basedOn w:val="705"/>
     <w:uiPriority w:val="99"/>
     <w:pPr>
       <w:pBdr/>
@@ -19655,9 +19706,9 @@
       </w:tcPr>
     </w:tblStylePr>
   </w:style>
-  <w:style w:type="table" w:styleId="69">
+  <w:style w:type="table" w:styleId="763">
     <w:name w:val="List Table 1 Light - Accent 1"/>
-    <w:basedOn w:val="11"/>
+    <w:basedOn w:val="705"/>
     <w:uiPriority w:val="99"/>
     <w:pPr>
       <w:pBdr/>
@@ -19871,9 +19922,9 @@
       </w:tcPr>
     </w:tblStylePr>
   </w:style>
-  <w:style w:type="table" w:styleId="70">
+  <w:style w:type="table" w:styleId="764">
     <w:name w:val="List Table 1 Light - Accent 2"/>
-    <w:basedOn w:val="11"/>
+    <w:basedOn w:val="705"/>
     <w:uiPriority w:val="99"/>
     <w:pPr>
       <w:pBdr/>
@@ -20087,9 +20138,9 @@
       </w:tcPr>
     </w:tblStylePr>
   </w:style>
-  <w:style w:type="table" w:styleId="71">
+  <w:style w:type="table" w:styleId="765">
     <w:name w:val="List Table 1 Light - Accent 3"/>
-    <w:basedOn w:val="11"/>
+    <w:basedOn w:val="705"/>
     <w:uiPriority w:val="99"/>
     <w:pPr>
       <w:pBdr/>
@@ -20303,9 +20354,9 @@
       </w:tcPr>
     </w:tblStylePr>
   </w:style>
-  <w:style w:type="table" w:styleId="72">
+  <w:style w:type="table" w:styleId="766">
     <w:name w:val="List Table 1 Light - Accent 4"/>
-    <w:basedOn w:val="11"/>
+    <w:basedOn w:val="705"/>
     <w:uiPriority w:val="99"/>
     <w:pPr>
       <w:pBdr/>
@@ -20519,9 +20570,9 @@
       </w:tcPr>
     </w:tblStylePr>
   </w:style>
-  <w:style w:type="table" w:styleId="73">
+  <w:style w:type="table" w:styleId="767">
     <w:name w:val="List Table 1 Light - Accent 5"/>
-    <w:basedOn w:val="11"/>
+    <w:basedOn w:val="705"/>
     <w:uiPriority w:val="99"/>
     <w:pPr>
       <w:pBdr/>
@@ -20735,9 +20786,9 @@
       </w:tcPr>
     </w:tblStylePr>
   </w:style>
-  <w:style w:type="table" w:styleId="74">
+  <w:style w:type="table" w:styleId="768">
     <w:name w:val="List Table 1 Light - Accent 6"/>
-    <w:basedOn w:val="11"/>
+    <w:basedOn w:val="705"/>
     <w:uiPriority w:val="99"/>
     <w:pPr>
       <w:pBdr/>
@@ -20951,9 +21002,9 @@
       </w:tcPr>
     </w:tblStylePr>
   </w:style>
-  <w:style w:type="table" w:styleId="75">
+  <w:style w:type="table" w:styleId="769">
     <w:name w:val="List Table 2"/>
-    <w:basedOn w:val="11"/>
+    <w:basedOn w:val="705"/>
     <w:uiPriority w:val="99"/>
     <w:pPr>
       <w:pBdr/>
@@ -21189,9 +21240,9 @@
       </w:tcPr>
     </w:tblStylePr>
   </w:style>
-  <w:style w:type="table" w:styleId="76">
+  <w:style w:type="table" w:styleId="770">
     <w:name w:val="List Table 2 - Accent 1"/>
-    <w:basedOn w:val="11"/>
+    <w:basedOn w:val="705"/>
     <w:uiPriority w:val="99"/>
     <w:pPr>
       <w:pBdr/>
@@ -21427,9 +21478,9 @@
       </w:tcPr>
     </w:tblStylePr>
   </w:style>
-  <w:style w:type="table" w:styleId="77">
+  <w:style w:type="table" w:styleId="771">
     <w:name w:val="List Table 2 - Accent 2"/>
-    <w:basedOn w:val="11"/>
+    <w:basedOn w:val="705"/>
     <w:uiPriority w:val="99"/>
     <w:pPr>
       <w:pBdr/>
@@ -21665,9 +21716,9 @@
       </w:tcPr>
     </w:tblStylePr>
   </w:style>
-  <w:style w:type="table" w:styleId="78">
+  <w:style w:type="table" w:styleId="772">
     <w:name w:val="List Table 2 - Accent 3"/>
-    <w:basedOn w:val="11"/>
+    <w:basedOn w:val="705"/>
     <w:uiPriority w:val="99"/>
     <w:pPr>
       <w:pBdr/>
@@ -21903,9 +21954,9 @@
       </w:tcPr>
     </w:tblStylePr>
   </w:style>
-  <w:style w:type="table" w:styleId="79">
+  <w:style w:type="table" w:styleId="773">
     <w:name w:val="List Table 2 - Accent 4"/>
-    <w:basedOn w:val="11"/>
+    <w:basedOn w:val="705"/>
     <w:uiPriority w:val="99"/>
     <w:pPr>
       <w:pBdr/>
@@ -22141,9 +22192,9 @@
       </w:tcPr>
     </w:tblStylePr>
   </w:style>
-  <w:style w:type="table" w:styleId="80">
+  <w:style w:type="table" w:styleId="774">
     <w:name w:val="List Table 2 - Accent 5"/>
-    <w:basedOn w:val="11"/>
+    <w:basedOn w:val="705"/>
     <w:uiPriority w:val="99"/>
     <w:pPr>
       <w:pBdr/>
@@ -22379,9 +22430,9 @@
       </w:tcPr>
     </w:tblStylePr>
   </w:style>
-  <w:style w:type="table" w:styleId="81">
+  <w:style w:type="table" w:styleId="775">
     <w:name w:val="List Table 2 - Accent 6"/>
-    <w:basedOn w:val="11"/>
+    <w:basedOn w:val="705"/>
     <w:uiPriority w:val="99"/>
     <w:pPr>
       <w:pBdr/>
@@ -22617,9 +22668,9 @@
       </w:tcPr>
     </w:tblStylePr>
   </w:style>
-  <w:style w:type="table" w:styleId="82">
+  <w:style w:type="table" w:styleId="776">
     <w:name w:val="List Table 3"/>
-    <w:basedOn w:val="11"/>
+    <w:basedOn w:val="705"/>
     <w:uiPriority w:val="99"/>
     <w:pPr>
       <w:pBdr/>
@@ -22845,9 +22896,9 @@
       </w:tcPr>
     </w:tblStylePr>
   </w:style>
-  <w:style w:type="table" w:styleId="83">
+  <w:style w:type="table" w:styleId="777">
     <w:name w:val="List Table 3 - Accent 1"/>
-    <w:basedOn w:val="11"/>
+    <w:basedOn w:val="705"/>
     <w:uiPriority w:val="99"/>
     <w:pPr>
       <w:pBdr/>
@@ -23073,9 +23124,9 @@
       </w:tcPr>
     </w:tblStylePr>
   </w:style>
-  <w:style w:type="table" w:styleId="84">
+  <w:style w:type="table" w:styleId="778">
     <w:name w:val="List Table 3 - Accent 2"/>
-    <w:basedOn w:val="11"/>
+    <w:basedOn w:val="705"/>
     <w:uiPriority w:val="99"/>
     <w:pPr>
       <w:pBdr/>
@@ -23301,9 +23352,9 @@
       </w:tcPr>
     </w:tblStylePr>
   </w:style>
-  <w:style w:type="table" w:styleId="85">
+  <w:style w:type="table" w:styleId="779">
     <w:name w:val="List Table 3 - Accent 3"/>
-    <w:basedOn w:val="11"/>
+    <w:basedOn w:val="705"/>
     <w:uiPriority w:val="99"/>
     <w:pPr>
       <w:pBdr/>
@@ -23529,9 +23580,9 @@
       </w:tcPr>
     </w:tblStylePr>
   </w:style>
-  <w:style w:type="table" w:styleId="86">
+  <w:style w:type="table" w:styleId="780">
     <w:name w:val="List Table 3 - Accent 4"/>
-    <w:basedOn w:val="11"/>
+    <w:basedOn w:val="705"/>
     <w:uiPriority w:val="99"/>
     <w:pPr>
       <w:pBdr/>
@@ -23757,9 +23808,9 @@
       </w:tcPr>
     </w:tblStylePr>
   </w:style>
-  <w:style w:type="table" w:styleId="87">
+  <w:style w:type="table" w:styleId="781">
     <w:name w:val="List Table 3 - Accent 5"/>
-    <w:basedOn w:val="11"/>
+    <w:basedOn w:val="705"/>
     <w:uiPriority w:val="99"/>
     <w:pPr>
       <w:pBdr/>
@@ -23985,9 +24036,9 @@
       </w:tcPr>
     </w:tblStylePr>
   </w:style>
-  <w:style w:type="table" w:styleId="88">
+  <w:style w:type="table" w:styleId="782">
     <w:name w:val="List Table 3 - Accent 6"/>
-    <w:basedOn w:val="11"/>
+    <w:basedOn w:val="705"/>
     <w:uiPriority w:val="99"/>
     <w:pPr>
       <w:pBdr/>
@@ -24213,9 +24264,9 @@
       </w:tcPr>
     </w:tblStylePr>
   </w:style>
-  <w:style w:type="table" w:styleId="89">
+  <w:style w:type="table" w:styleId="783">
     <w:name w:val="List Table 4"/>
-    <w:basedOn w:val="11"/>
+    <w:basedOn w:val="705"/>
     <w:uiPriority w:val="99"/>
     <w:pPr>
       <w:pBdr/>
@@ -24438,9 +24489,9 @@
       </w:tcPr>
     </w:tblStylePr>
   </w:style>
-  <w:style w:type="table" w:styleId="90">
+  <w:style w:type="table" w:styleId="784">
     <w:name w:val="List Table 4 - Accent 1"/>
-    <w:basedOn w:val="11"/>
+    <w:basedOn w:val="705"/>
     <w:uiPriority w:val="99"/>
     <w:pPr>
       <w:pBdr/>
@@ -24663,9 +24714,9 @@
       </w:tcPr>
     </w:tblStylePr>
   </w:style>
-  <w:style w:type="table" w:styleId="91">
+  <w:style w:type="table" w:styleId="785">
     <w:name w:val="List Table 4 - Accent 2"/>
-    <w:basedOn w:val="11"/>
+    <w:basedOn w:val="705"/>
     <w:uiPriority w:val="99"/>
     <w:pPr>
       <w:pBdr/>
@@ -24888,9 +24939,9 @@
       </w:tcPr>
     </w:tblStylePr>
   </w:style>
-  <w:style w:type="table" w:styleId="92">
+  <w:style w:type="table" w:styleId="786">
     <w:name w:val="List Table 4 - Accent 3"/>
-    <w:basedOn w:val="11"/>
+    <w:basedOn w:val="705"/>
     <w:uiPriority w:val="99"/>
     <w:pPr>
       <w:pBdr/>
@@ -25113,9 +25164,9 @@
       </w:tcPr>
     </w:tblStylePr>
   </w:style>
-  <w:style w:type="table" w:styleId="93">
+  <w:style w:type="table" w:styleId="787">
     <w:name w:val="List Table 4 - Accent 4"/>
-    <w:basedOn w:val="11"/>
+    <w:basedOn w:val="705"/>
     <w:uiPriority w:val="99"/>
     <w:pPr>
       <w:pBdr/>
@@ -25338,9 +25389,9 @@
       </w:tcPr>
     </w:tblStylePr>
   </w:style>
-  <w:style w:type="table" w:styleId="94">
+  <w:style w:type="table" w:styleId="788">
     <w:name w:val="List Table 4 - Accent 5"/>
-    <w:basedOn w:val="11"/>
+    <w:basedOn w:val="705"/>
     <w:uiPriority w:val="99"/>
     <w:pPr>
       <w:pBdr/>
@@ -25563,9 +25614,9 @@
       </w:tcPr>
     </w:tblStylePr>
   </w:style>
-  <w:style w:type="table" w:styleId="95">
+  <w:style w:type="table" w:styleId="789">
     <w:name w:val="List Table 4 - Accent 6"/>
-    <w:basedOn w:val="11"/>
+    <w:basedOn w:val="705"/>
     <w:uiPriority w:val="99"/>
     <w:pPr>
       <w:pBdr/>
@@ -25788,9 +25839,9 @@
       </w:tcPr>
     </w:tblStylePr>
   </w:style>
-  <w:style w:type="table" w:styleId="96">
+  <w:style w:type="table" w:styleId="790">
     <w:name w:val="List Table 5 Dark"/>
-    <w:basedOn w:val="11"/>
+    <w:basedOn w:val="705"/>
     <w:uiPriority w:val="99"/>
     <w:pPr>
       <w:pBdr/>
@@ -26030,9 +26081,9 @@
       </w:tcPr>
     </w:tblStylePr>
   </w:style>
-  <w:style w:type="table" w:styleId="97">
+  <w:style w:type="table" w:styleId="791">
     <w:name w:val="List Table 5 Dark - Accent 1"/>
-    <w:basedOn w:val="11"/>
+    <w:basedOn w:val="705"/>
     <w:uiPriority w:val="99"/>
     <w:pPr>
       <w:pBdr/>
@@ -26272,9 +26323,9 @@
       </w:tcPr>
     </w:tblStylePr>
   </w:style>
-  <w:style w:type="table" w:styleId="98">
+  <w:style w:type="table" w:styleId="792">
     <w:name w:val="List Table 5 Dark - Accent 2"/>
-    <w:basedOn w:val="11"/>
+    <w:basedOn w:val="705"/>
     <w:uiPriority w:val="99"/>
     <w:pPr>
       <w:pBdr/>
@@ -26514,9 +26565,9 @@
       </w:tcPr>
     </w:tblStylePr>
   </w:style>
-  <w:style w:type="table" w:styleId="99">
+  <w:style w:type="table" w:styleId="793">
     <w:name w:val="List Table 5 Dark - Accent 3"/>
-    <w:basedOn w:val="11"/>
+    <w:basedOn w:val="705"/>
     <w:uiPriority w:val="99"/>
     <w:pPr>
       <w:pBdr/>
@@ -26756,9 +26807,9 @@
       </w:tcPr>
     </w:tblStylePr>
   </w:style>
-  <w:style w:type="table" w:styleId="100">
+  <w:style w:type="table" w:styleId="794">
     <w:name w:val="List Table 5 Dark - Accent 4"/>
-    <w:basedOn w:val="11"/>
+    <w:basedOn w:val="705"/>
     <w:uiPriority w:val="99"/>
     <w:pPr>
       <w:pBdr/>
@@ -26998,9 +27049,9 @@
       </w:tcPr>
     </w:tblStylePr>
   </w:style>
-  <w:style w:type="table" w:styleId="101">
+  <w:style w:type="table" w:styleId="795">
     <w:name w:val="List Table 5 Dark - Accent 5"/>
-    <w:basedOn w:val="11"/>
+    <w:basedOn w:val="705"/>
     <w:uiPriority w:val="99"/>
     <w:pPr>
       <w:pBdr/>
@@ -27240,9 +27291,9 @@
       </w:tcPr>
     </w:tblStylePr>
   </w:style>
-  <w:style w:type="table" w:styleId="102">
+  <w:style w:type="table" w:styleId="796">
     <w:name w:val="List Table 5 Dark - Accent 6"/>
-    <w:basedOn w:val="11"/>
+    <w:basedOn w:val="705"/>
     <w:uiPriority w:val="99"/>
     <w:pPr>
       <w:pBdr/>
@@ -27482,9 +27533,9 @@
       </w:tcPr>
     </w:tblStylePr>
   </w:style>
-  <w:style w:type="table" w:styleId="103">
+  <w:style w:type="table" w:styleId="797">
     <w:name w:val="List Table 6 Colorful"/>
-    <w:basedOn w:val="11"/>
+    <w:basedOn w:val="705"/>
     <w:uiPriority w:val="99"/>
     <w:pPr>
       <w:pBdr/>
@@ -27705,9 +27756,9 @@
       </w:tcPr>
     </w:tblStylePr>
   </w:style>
-  <w:style w:type="table" w:styleId="104">
+  <w:style w:type="table" w:styleId="798">
     <w:name w:val="List Table 6 Colorful - Accent 1"/>
-    <w:basedOn w:val="11"/>
+    <w:basedOn w:val="705"/>
     <w:uiPriority w:val="99"/>
     <w:pPr>
       <w:pBdr/>
@@ -27928,9 +27979,9 @@
       </w:tcPr>
     </w:tblStylePr>
   </w:style>
-  <w:style w:type="table" w:styleId="105">
+  <w:style w:type="table" w:styleId="799">
     <w:name w:val="List Table 6 Colorful - Accent 2"/>
-    <w:basedOn w:val="11"/>
+    <w:basedOn w:val="705"/>
     <w:uiPriority w:val="99"/>
     <w:pPr>
       <w:pBdr/>
@@ -28151,9 +28202,9 @@
       </w:tcPr>
     </w:tblStylePr>
   </w:style>
-  <w:style w:type="table" w:styleId="106">
+  <w:style w:type="table" w:styleId="800">
     <w:name w:val="List Table 6 Colorful - Accent 3"/>
-    <w:basedOn w:val="11"/>
+    <w:basedOn w:val="705"/>
     <w:uiPriority w:val="99"/>
     <w:pPr>
       <w:pBdr/>
@@ -28374,9 +28425,9 @@
       </w:tcPr>
     </w:tblStylePr>
   </w:style>
-  <w:style w:type="table" w:styleId="107">
+  <w:style w:type="table" w:styleId="801">
     <w:name w:val="List Table 6 Colorful - Accent 4"/>
-    <w:basedOn w:val="11"/>
+    <w:basedOn w:val="705"/>
     <w:uiPriority w:val="99"/>
     <w:pPr>
       <w:pBdr/>
@@ -28597,9 +28648,9 @@
       </w:tcPr>
     </w:tblStylePr>
   </w:style>
-  <w:style w:type="table" w:styleId="108">
+  <w:style w:type="table" w:styleId="802">
     <w:name w:val="List Table 6 Colorful - Accent 5"/>
-    <w:basedOn w:val="11"/>
+    <w:basedOn w:val="705"/>
     <w:uiPriority w:val="99"/>
     <w:pPr>
       <w:pBdr/>
@@ -28820,9 +28871,9 @@
       </w:tcPr>
     </w:tblStylePr>
   </w:style>
-  <w:style w:type="table" w:styleId="109">
+  <w:style w:type="table" w:styleId="803">
     <w:name w:val="List Table 6 Colorful - Accent 6"/>
-    <w:basedOn w:val="11"/>
+    <w:basedOn w:val="705"/>
     <w:uiPriority w:val="99"/>
     <w:pPr>
       <w:pBdr/>
@@ -29043,9 +29094,9 @@
       </w:tcPr>
     </w:tblStylePr>
   </w:style>
-  <w:style w:type="table" w:styleId="110">
+  <w:style w:type="table" w:styleId="804">
     <w:name w:val="List Table 7 Colorful"/>
-    <w:basedOn w:val="11"/>
+    <w:basedOn w:val="705"/>
     <w:uiPriority w:val="99"/>
     <w:pPr>
       <w:pBdr/>
@@ -29144,11 +29195,11 @@
         <w:tblBorders/>
       </w:tblPr>
       <w:tcPr>
-        <w:shd w:color="ffffff"/>
+        <w:shd w:val="clear" w:color="ffffff"/>
         <w:tcBorders>
-          <w:top w:val="none"/>
-          <w:left w:val="none"/>
-          <w:bottom w:val="none"/>
+          <w:top w:val="none" w:color="000000" w:sz="4" w:space="0"/>
+          <w:left w:val="none" w:color="000000" w:sz="4" w:space="0"/>
+          <w:bottom w:val="none" w:color="000000" w:sz="4" w:space="0"/>
           <w:right w:val="single" w:color="000000" w:themeColor="text1" w:themeTint="80" w:sz="4" w:space="0"/>
         </w:tcBorders>
       </w:tcPr>
@@ -29171,10 +29222,10 @@
       <w:tcPr>
         <w:shd w:val="clear" w:color="ffffff" w:themeColor="light1" w:fill="ffffff" w:themeFill="light1"/>
         <w:tcBorders>
-          <w:top w:val="none"/>
-          <w:left w:val="none"/>
+          <w:top w:val="none" w:color="000000" w:sz="4" w:space="0"/>
+          <w:left w:val="none" w:color="000000" w:sz="4" w:space="0"/>
           <w:bottom w:val="single" w:color="000000" w:themeColor="text1" w:themeTint="80" w:sz="4" w:space="0"/>
-          <w:right w:val="none"/>
+          <w:right w:val="none" w:color="000000" w:sz="4" w:space="0"/>
         </w:tcBorders>
       </w:tcPr>
     </w:tblStylePr>
@@ -29194,12 +29245,12 @@
         <w:tblBorders/>
       </w:tblPr>
       <w:tcPr>
-        <w:shd w:color="ffffff"/>
+        <w:shd w:val="clear" w:color="ffffff"/>
         <w:tcBorders>
-          <w:top w:val="none"/>
+          <w:top w:val="none" w:color="000000" w:sz="4" w:space="0"/>
           <w:left w:val="single" w:color="000000" w:themeColor="text1" w:themeTint="80" w:sz="4" w:space="0"/>
-          <w:bottom w:val="none"/>
-          <w:right w:val="none"/>
+          <w:bottom w:val="none" w:color="000000" w:sz="4" w:space="0"/>
+          <w:right w:val="none" w:color="000000" w:sz="4" w:space="0"/>
         </w:tcBorders>
       </w:tcPr>
     </w:tblStylePr>
@@ -29222,9 +29273,9 @@
         <w:shd w:val="clear" w:color="ffffff" w:themeColor="light1" w:fill="ffffff" w:themeFill="light1"/>
         <w:tcBorders>
           <w:top w:val="single" w:color="000000" w:themeColor="text1" w:themeTint="80" w:sz="4" w:space="0"/>
-          <w:left w:val="none"/>
-          <w:bottom w:val="none"/>
-          <w:right w:val="none"/>
+          <w:left w:val="none" w:color="000000" w:sz="4" w:space="0"/>
+          <w:bottom w:val="none" w:color="000000" w:sz="4" w:space="0"/>
+          <w:right w:val="none" w:color="000000" w:sz="4" w:space="0"/>
         </w:tcBorders>
       </w:tcPr>
     </w:tblStylePr>
@@ -29299,9 +29350,9 @@
       </w:tcPr>
     </w:tblStylePr>
   </w:style>
-  <w:style w:type="table" w:styleId="111">
+  <w:style w:type="table" w:styleId="805">
     <w:name w:val="List Table 7 Colorful - Accent 1"/>
-    <w:basedOn w:val="11"/>
+    <w:basedOn w:val="705"/>
     <w:uiPriority w:val="99"/>
     <w:pPr>
       <w:pBdr/>
@@ -29400,11 +29451,11 @@
         <w:tblBorders/>
       </w:tblPr>
       <w:tcPr>
-        <w:shd w:color="ffffff"/>
+        <w:shd w:val="clear" w:color="ffffff"/>
         <w:tcBorders>
-          <w:top w:val="none"/>
-          <w:left w:val="none"/>
-          <w:bottom w:val="none"/>
+          <w:top w:val="none" w:color="000000" w:sz="4" w:space="0"/>
+          <w:left w:val="none" w:color="000000" w:sz="4" w:space="0"/>
+          <w:bottom w:val="none" w:color="000000" w:sz="4" w:space="0"/>
           <w:right w:val="single" w:color="000000" w:themeColor="accent1" w:sz="4" w:space="0"/>
         </w:tcBorders>
       </w:tcPr>
@@ -29427,10 +29478,10 @@
       <w:tcPr>
         <w:shd w:val="clear" w:color="ffffff" w:themeColor="light1" w:fill="ffffff" w:themeFill="light1"/>
         <w:tcBorders>
-          <w:top w:val="none"/>
-          <w:left w:val="none"/>
+          <w:top w:val="none" w:color="000000" w:sz="4" w:space="0"/>
+          <w:left w:val="none" w:color="000000" w:sz="4" w:space="0"/>
           <w:bottom w:val="single" w:color="000000" w:themeColor="accent1" w:sz="4" w:space="0"/>
-          <w:right w:val="none"/>
+          <w:right w:val="none" w:color="000000" w:sz="4" w:space="0"/>
         </w:tcBorders>
       </w:tcPr>
     </w:tblStylePr>
@@ -29450,12 +29501,12 @@
         <w:tblBorders/>
       </w:tblPr>
       <w:tcPr>
-        <w:shd w:color="ffffff"/>
+        <w:shd w:val="clear" w:color="ffffff"/>
         <w:tcBorders>
-          <w:top w:val="none"/>
+          <w:top w:val="none" w:color="000000" w:sz="4" w:space="0"/>
           <w:left w:val="single" w:color="000000" w:themeColor="accent1" w:sz="4" w:space="0"/>
-          <w:bottom w:val="none"/>
-          <w:right w:val="none"/>
+          <w:bottom w:val="none" w:color="000000" w:sz="4" w:space="0"/>
+          <w:right w:val="none" w:color="000000" w:sz="4" w:space="0"/>
         </w:tcBorders>
       </w:tcPr>
     </w:tblStylePr>
@@ -29478,9 +29529,9 @@
         <w:shd w:val="clear" w:color="ffffff" w:themeColor="light1" w:fill="ffffff" w:themeFill="light1"/>
         <w:tcBorders>
           <w:top w:val="single" w:color="000000" w:themeColor="accent1" w:sz="4" w:space="0"/>
-          <w:left w:val="none"/>
-          <w:bottom w:val="none"/>
-          <w:right w:val="none"/>
+          <w:left w:val="none" w:color="000000" w:sz="4" w:space="0"/>
+          <w:bottom w:val="none" w:color="000000" w:sz="4" w:space="0"/>
+          <w:right w:val="none" w:color="000000" w:sz="4" w:space="0"/>
         </w:tcBorders>
       </w:tcPr>
     </w:tblStylePr>
@@ -29555,9 +29606,9 @@
       </w:tcPr>
     </w:tblStylePr>
   </w:style>
-  <w:style w:type="table" w:styleId="112">
+  <w:style w:type="table" w:styleId="806">
     <w:name w:val="List Table 7 Colorful - Accent 2"/>
-    <w:basedOn w:val="11"/>
+    <w:basedOn w:val="705"/>
     <w:uiPriority w:val="99"/>
     <w:pPr>
       <w:pBdr/>
@@ -29656,11 +29707,11 @@
         <w:tblBorders/>
       </w:tblPr>
       <w:tcPr>
-        <w:shd w:color="ffffff"/>
+        <w:shd w:val="clear" w:color="ffffff"/>
         <w:tcBorders>
-          <w:top w:val="none"/>
-          <w:left w:val="none"/>
-          <w:bottom w:val="none"/>
+          <w:top w:val="none" w:color="000000" w:sz="4" w:space="0"/>
+          <w:left w:val="none" w:color="000000" w:sz="4" w:space="0"/>
+          <w:bottom w:val="none" w:color="000000" w:sz="4" w:space="0"/>
           <w:right w:val="single" w:color="000000" w:themeColor="accent2" w:themeTint="97" w:sz="4" w:space="0"/>
         </w:tcBorders>
       </w:tcPr>
@@ -29683,10 +29734,10 @@
       <w:tcPr>
         <w:shd w:val="clear" w:color="ffffff" w:themeColor="light1" w:fill="ffffff" w:themeFill="light1"/>
         <w:tcBorders>
-          <w:top w:val="none"/>
-          <w:left w:val="none"/>
+          <w:top w:val="none" w:color="000000" w:sz="4" w:space="0"/>
+          <w:left w:val="none" w:color="000000" w:sz="4" w:space="0"/>
           <w:bottom w:val="single" w:color="000000" w:themeColor="accent2" w:themeTint="97" w:sz="4" w:space="0"/>
-          <w:right w:val="none"/>
+          <w:right w:val="none" w:color="000000" w:sz="4" w:space="0"/>
         </w:tcBorders>
       </w:tcPr>
     </w:tblStylePr>
@@ -29706,12 +29757,12 @@
         <w:tblBorders/>
       </w:tblPr>
       <w:tcPr>
-        <w:shd w:color="ffffff"/>
+        <w:shd w:val="clear" w:color="ffffff"/>
         <w:tcBorders>
-          <w:top w:val="none"/>
+          <w:top w:val="none" w:color="000000" w:sz="4" w:space="0"/>
           <w:left w:val="single" w:color="000000" w:themeColor="accent2" w:themeTint="97" w:sz="4" w:space="0"/>
-          <w:bottom w:val="none"/>
-          <w:right w:val="none"/>
+          <w:bottom w:val="none" w:color="000000" w:sz="4" w:space="0"/>
+          <w:right w:val="none" w:color="000000" w:sz="4" w:space="0"/>
         </w:tcBorders>
       </w:tcPr>
     </w:tblStylePr>
@@ -29734,9 +29785,9 @@
         <w:shd w:val="clear" w:color="ffffff" w:themeColor="light1" w:fill="ffffff" w:themeFill="light1"/>
         <w:tcBorders>
           <w:top w:val="single" w:color="000000" w:themeColor="accent2" w:themeTint="97" w:sz="4" w:space="0"/>
-          <w:left w:val="none"/>
-          <w:bottom w:val="none"/>
-          <w:right w:val="none"/>
+          <w:left w:val="none" w:color="000000" w:sz="4" w:space="0"/>
+          <w:bottom w:val="none" w:color="000000" w:sz="4" w:space="0"/>
+          <w:right w:val="none" w:color="000000" w:sz="4" w:space="0"/>
         </w:tcBorders>
       </w:tcPr>
     </w:tblStylePr>
@@ -29811,9 +29862,9 @@
       </w:tcPr>
     </w:tblStylePr>
   </w:style>
-  <w:style w:type="table" w:styleId="113">
+  <w:style w:type="table" w:styleId="807">
     <w:name w:val="List Table 7 Colorful - Accent 3"/>
-    <w:basedOn w:val="11"/>
+    <w:basedOn w:val="705"/>
     <w:uiPriority w:val="99"/>
     <w:pPr>
       <w:pBdr/>
@@ -29912,11 +29963,11 @@
         <w:tblBorders/>
       </w:tblPr>
       <w:tcPr>
-        <w:shd w:color="ffffff"/>
+        <w:shd w:val="clear" w:color="ffffff"/>
         <w:tcBorders>
-          <w:top w:val="none"/>
-          <w:left w:val="none"/>
-          <w:bottom w:val="none"/>
+          <w:top w:val="none" w:color="000000" w:sz="4" w:space="0"/>
+          <w:left w:val="none" w:color="000000" w:sz="4" w:space="0"/>
+          <w:bottom w:val="none" w:color="000000" w:sz="4" w:space="0"/>
           <w:right w:val="single" w:color="000000" w:themeColor="accent3" w:themeTint="98" w:sz="4" w:space="0"/>
         </w:tcBorders>
       </w:tcPr>
@@ -29939,10 +29990,10 @@
       <w:tcPr>
         <w:shd w:val="clear" w:color="ffffff" w:themeColor="light1" w:fill="ffffff" w:themeFill="light1"/>
         <w:tcBorders>
-          <w:top w:val="none"/>
-          <w:left w:val="none"/>
+          <w:top w:val="none" w:color="000000" w:sz="4" w:space="0"/>
+          <w:left w:val="none" w:color="000000" w:sz="4" w:space="0"/>
           <w:bottom w:val="single" w:color="000000" w:themeColor="accent3" w:themeTint="98" w:sz="4" w:space="0"/>
-          <w:right w:val="none"/>
+          <w:right w:val="none" w:color="000000" w:sz="4" w:space="0"/>
         </w:tcBorders>
       </w:tcPr>
     </w:tblStylePr>
@@ -29962,12 +30013,12 @@
         <w:tblBorders/>
       </w:tblPr>
       <w:tcPr>
-        <w:shd w:color="ffffff"/>
+        <w:shd w:val="clear" w:color="ffffff"/>
         <w:tcBorders>
-          <w:top w:val="none"/>
+          <w:top w:val="none" w:color="000000" w:sz="4" w:space="0"/>
           <w:left w:val="single" w:color="000000" w:themeColor="accent3" w:themeTint="98" w:sz="4" w:space="0"/>
-          <w:bottom w:val="none"/>
-          <w:right w:val="none"/>
+          <w:bottom w:val="none" w:color="000000" w:sz="4" w:space="0"/>
+          <w:right w:val="none" w:color="000000" w:sz="4" w:space="0"/>
         </w:tcBorders>
       </w:tcPr>
     </w:tblStylePr>
@@ -29990,9 +30041,9 @@
         <w:shd w:val="clear" w:color="ffffff" w:themeColor="light1" w:fill="ffffff" w:themeFill="light1"/>
         <w:tcBorders>
           <w:top w:val="single" w:color="000000" w:themeColor="accent3" w:themeTint="98" w:sz="4" w:space="0"/>
-          <w:left w:val="none"/>
-          <w:bottom w:val="none"/>
-          <w:right w:val="none"/>
+          <w:left w:val="none" w:color="000000" w:sz="4" w:space="0"/>
+          <w:bottom w:val="none" w:color="000000" w:sz="4" w:space="0"/>
+          <w:right w:val="none" w:color="000000" w:sz="4" w:space="0"/>
         </w:tcBorders>
       </w:tcPr>
     </w:tblStylePr>
@@ -30067,9 +30118,9 @@
       </w:tcPr>
     </w:tblStylePr>
   </w:style>
-  <w:style w:type="table" w:styleId="114">
+  <w:style w:type="table" w:styleId="808">
     <w:name w:val="List Table 7 Colorful - Accent 4"/>
-    <w:basedOn w:val="11"/>
+    <w:basedOn w:val="705"/>
     <w:uiPriority w:val="99"/>
     <w:pPr>
       <w:pBdr/>
@@ -30168,11 +30219,11 @@
         <w:tblBorders/>
       </w:tblPr>
       <w:tcPr>
-        <w:shd w:color="ffffff"/>
+        <w:shd w:val="clear" w:color="ffffff"/>
         <w:tcBorders>
-          <w:top w:val="none"/>
-          <w:left w:val="none"/>
-          <w:bottom w:val="none"/>
+          <w:top w:val="none" w:color="000000" w:sz="4" w:space="0"/>
+          <w:left w:val="none" w:color="000000" w:sz="4" w:space="0"/>
+          <w:bottom w:val="none" w:color="000000" w:sz="4" w:space="0"/>
           <w:right w:val="single" w:color="000000" w:themeColor="accent4" w:themeTint="9A" w:sz="4" w:space="0"/>
         </w:tcBorders>
       </w:tcPr>
@@ -30195,10 +30246,10 @@
       <w:tcPr>
         <w:shd w:val="clear" w:color="ffffff" w:themeColor="light1" w:fill="ffffff" w:themeFill="light1"/>
         <w:tcBorders>
-          <w:top w:val="none"/>
-          <w:left w:val="none"/>
+          <w:top w:val="none" w:color="000000" w:sz="4" w:space="0"/>
+          <w:left w:val="none" w:color="000000" w:sz="4" w:space="0"/>
           <w:bottom w:val="single" w:color="000000" w:themeColor="accent4" w:themeTint="9A" w:sz="4" w:space="0"/>
-          <w:right w:val="none"/>
+          <w:right w:val="none" w:color="000000" w:sz="4" w:space="0"/>
         </w:tcBorders>
       </w:tcPr>
     </w:tblStylePr>
@@ -30218,12 +30269,12 @@
         <w:tblBorders/>
       </w:tblPr>
       <w:tcPr>
-        <w:shd w:color="ffffff"/>
+        <w:shd w:val="clear" w:color="ffffff"/>
         <w:tcBorders>
-          <w:top w:val="none"/>
+          <w:top w:val="none" w:color="000000" w:sz="4" w:space="0"/>
           <w:left w:val="single" w:color="000000" w:themeColor="accent4" w:themeTint="9A" w:sz="4" w:space="0"/>
-          <w:bottom w:val="none"/>
-          <w:right w:val="none"/>
+          <w:bottom w:val="none" w:color="000000" w:sz="4" w:space="0"/>
+          <w:right w:val="none" w:color="000000" w:sz="4" w:space="0"/>
         </w:tcBorders>
       </w:tcPr>
     </w:tblStylePr>
@@ -30246,9 +30297,9 @@
         <w:shd w:val="clear" w:color="ffffff" w:themeColor="light1" w:fill="ffffff" w:themeFill="light1"/>
         <w:tcBorders>
           <w:top w:val="single" w:color="000000" w:themeColor="accent4" w:themeTint="9A" w:sz="4" w:space="0"/>
-          <w:left w:val="none"/>
-          <w:bottom w:val="none"/>
-          <w:right w:val="none"/>
+          <w:left w:val="none" w:color="000000" w:sz="4" w:space="0"/>
+          <w:bottom w:val="none" w:color="000000" w:sz="4" w:space="0"/>
+          <w:right w:val="none" w:color="000000" w:sz="4" w:space="0"/>
         </w:tcBorders>
       </w:tcPr>
     </w:tblStylePr>
@@ -30323,9 +30374,9 @@
       </w:tcPr>
     </w:tblStylePr>
   </w:style>
-  <w:style w:type="table" w:styleId="115">
+  <w:style w:type="table" w:styleId="809">
     <w:name w:val="List Table 7 Colorful - Accent 5"/>
-    <w:basedOn w:val="11"/>
+    <w:basedOn w:val="705"/>
     <w:uiPriority w:val="99"/>
     <w:pPr>
       <w:pBdr/>
@@ -30424,11 +30475,11 @@
         <w:tblBorders/>
       </w:tblPr>
       <w:tcPr>
-        <w:shd w:color="ffffff"/>
+        <w:shd w:val="clear" w:color="ffffff"/>
         <w:tcBorders>
-          <w:top w:val="none"/>
-          <w:left w:val="none"/>
-          <w:bottom w:val="none"/>
+          <w:top w:val="none" w:color="000000" w:sz="4" w:space="0"/>
+          <w:left w:val="none" w:color="000000" w:sz="4" w:space="0"/>
+          <w:bottom w:val="none" w:color="000000" w:sz="4" w:space="0"/>
           <w:right w:val="single" w:color="000000" w:themeColor="accent5" w:themeTint="9A" w:sz="4" w:space="0"/>
         </w:tcBorders>
       </w:tcPr>
@@ -30451,10 +30502,10 @@
       <w:tcPr>
         <w:shd w:val="clear" w:color="ffffff" w:themeColor="light1" w:fill="ffffff" w:themeFill="light1"/>
         <w:tcBorders>
-          <w:top w:val="none"/>
-          <w:left w:val="none"/>
+          <w:top w:val="none" w:color="000000" w:sz="4" w:space="0"/>
+          <w:left w:val="none" w:color="000000" w:sz="4" w:space="0"/>
           <w:bottom w:val="single" w:color="000000" w:themeColor="accent5" w:themeTint="9A" w:sz="4" w:space="0"/>
-          <w:right w:val="none"/>
+          <w:right w:val="none" w:color="000000" w:sz="4" w:space="0"/>
         </w:tcBorders>
       </w:tcPr>
     </w:tblStylePr>
@@ -30474,12 +30525,12 @@
         <w:tblBorders/>
       </w:tblPr>
       <w:tcPr>
-        <w:shd w:color="ffffff"/>
+        <w:shd w:val="clear" w:color="ffffff"/>
         <w:tcBorders>
-          <w:top w:val="none"/>
+          <w:top w:val="none" w:color="000000" w:sz="4" w:space="0"/>
           <w:left w:val="single" w:color="000000" w:themeColor="accent5" w:themeTint="9A" w:sz="4" w:space="0"/>
-          <w:bottom w:val="none"/>
-          <w:right w:val="none"/>
+          <w:bottom w:val="none" w:color="000000" w:sz="4" w:space="0"/>
+          <w:right w:val="none" w:color="000000" w:sz="4" w:space="0"/>
         </w:tcBorders>
       </w:tcPr>
     </w:tblStylePr>
@@ -30502,9 +30553,9 @@
         <w:shd w:val="clear" w:color="ffffff" w:themeColor="light1" w:fill="ffffff" w:themeFill="light1"/>
         <w:tcBorders>
           <w:top w:val="single" w:color="000000" w:themeColor="accent5" w:themeTint="9A" w:sz="4" w:space="0"/>
-          <w:left w:val="none"/>
-          <w:bottom w:val="none"/>
-          <w:right w:val="none"/>
+          <w:left w:val="none" w:color="000000" w:sz="4" w:space="0"/>
+          <w:bottom w:val="none" w:color="000000" w:sz="4" w:space="0"/>
+          <w:right w:val="none" w:color="000000" w:sz="4" w:space="0"/>
         </w:tcBorders>
       </w:tcPr>
     </w:tblStylePr>
@@ -30579,9 +30630,9 @@
       </w:tcPr>
     </w:tblStylePr>
   </w:style>
-  <w:style w:type="table" w:styleId="116">
+  <w:style w:type="table" w:styleId="810">
     <w:name w:val="List Table 7 Colorful - Accent 6"/>
-    <w:basedOn w:val="11"/>
+    <w:basedOn w:val="705"/>
     <w:uiPriority w:val="99"/>
     <w:pPr>
       <w:pBdr/>
@@ -30680,11 +30731,11 @@
         <w:tblBorders/>
       </w:tblPr>
       <w:tcPr>
-        <w:shd w:color="ffffff"/>
+        <w:shd w:val="clear" w:color="ffffff"/>
         <w:tcBorders>
-          <w:top w:val="none"/>
-          <w:left w:val="none"/>
-          <w:bottom w:val="none"/>
+          <w:top w:val="none" w:color="000000" w:sz="4" w:space="0"/>
+          <w:left w:val="none" w:color="000000" w:sz="4" w:space="0"/>
+          <w:bottom w:val="none" w:color="000000" w:sz="4" w:space="0"/>
           <w:right w:val="single" w:color="000000" w:themeColor="accent6" w:themeTint="98" w:sz="4" w:space="0"/>
         </w:tcBorders>
       </w:tcPr>
@@ -30707,10 +30758,10 @@
       <w:tcPr>
         <w:shd w:val="clear" w:color="ffffff" w:themeColor="light1" w:fill="ffffff" w:themeFill="light1"/>
         <w:tcBorders>
-          <w:top w:val="none"/>
-          <w:left w:val="none"/>
+          <w:top w:val="none" w:color="000000" w:sz="4" w:space="0"/>
+          <w:left w:val="none" w:color="000000" w:sz="4" w:space="0"/>
           <w:bottom w:val="single" w:color="000000" w:themeColor="accent6" w:themeTint="98" w:sz="4" w:space="0"/>
-          <w:right w:val="none"/>
+          <w:right w:val="none" w:color="000000" w:sz="4" w:space="0"/>
         </w:tcBorders>
       </w:tcPr>
     </w:tblStylePr>
@@ -30730,12 +30781,12 @@
         <w:tblBorders/>
       </w:tblPr>
       <w:tcPr>
-        <w:shd w:color="ffffff"/>
+        <w:shd w:val="clear" w:color="ffffff"/>
         <w:tcBorders>
-          <w:top w:val="none"/>
+          <w:top w:val="none" w:color="000000" w:sz="4" w:space="0"/>
           <w:left w:val="single" w:color="000000" w:themeColor="accent6" w:themeTint="98" w:sz="4" w:space="0"/>
-          <w:bottom w:val="none"/>
-          <w:right w:val="none"/>
+          <w:bottom w:val="none" w:color="000000" w:sz="4" w:space="0"/>
+          <w:right w:val="none" w:color="000000" w:sz="4" w:space="0"/>
         </w:tcBorders>
       </w:tcPr>
     </w:tblStylePr>
@@ -30758,9 +30809,9 @@
         <w:shd w:val="clear" w:color="ffffff" w:themeColor="light1" w:fill="ffffff" w:themeFill="light1"/>
         <w:tcBorders>
           <w:top w:val="single" w:color="000000" w:themeColor="accent6" w:themeTint="98" w:sz="4" w:space="0"/>
-          <w:left w:val="none"/>
-          <w:bottom w:val="none"/>
-          <w:right w:val="none"/>
+          <w:left w:val="none" w:color="000000" w:sz="4" w:space="0"/>
+          <w:bottom w:val="none" w:color="000000" w:sz="4" w:space="0"/>
+          <w:right w:val="none" w:color="000000" w:sz="4" w:space="0"/>
         </w:tcBorders>
       </w:tcPr>
     </w:tblStylePr>
@@ -30835,9 +30886,9 @@
       </w:tcPr>
     </w:tblStylePr>
   </w:style>
-  <w:style w:type="table" w:styleId="117">
+  <w:style w:type="table" w:styleId="811">
     <w:name w:val="Lined - Accent"/>
-    <w:basedOn w:val="11"/>
+    <w:basedOn w:val="705"/>
     <w:uiPriority w:val="99"/>
     <w:pPr>
       <w:pBdr/>
@@ -31072,9 +31123,9 @@
       </w:tcPr>
     </w:tblStylePr>
   </w:style>
-  <w:style w:type="table" w:styleId="118">
+  <w:style w:type="table" w:styleId="812">
     <w:name w:val="Lined - Accent 1"/>
-    <w:basedOn w:val="11"/>
+    <w:basedOn w:val="705"/>
     <w:uiPriority w:val="99"/>
     <w:pPr>
       <w:pBdr/>
@@ -31309,9 +31360,9 @@
       </w:tcPr>
     </w:tblStylePr>
   </w:style>
-  <w:style w:type="table" w:styleId="119">
+  <w:style w:type="table" w:styleId="813">
     <w:name w:val="Lined - Accent 2"/>
-    <w:basedOn w:val="11"/>
+    <w:basedOn w:val="705"/>
     <w:uiPriority w:val="99"/>
     <w:pPr>
       <w:pBdr/>
@@ -31546,9 +31597,9 @@
       </w:tcPr>
     </w:tblStylePr>
   </w:style>
-  <w:style w:type="table" w:styleId="120">
+  <w:style w:type="table" w:styleId="814">
     <w:name w:val="Lined - Accent 3"/>
-    <w:basedOn w:val="11"/>
+    <w:basedOn w:val="705"/>
     <w:uiPriority w:val="99"/>
     <w:pPr>
       <w:pBdr/>
@@ -31783,9 +31834,9 @@
       </w:tcPr>
     </w:tblStylePr>
   </w:style>
-  <w:style w:type="table" w:styleId="121">
+  <w:style w:type="table" w:styleId="815">
     <w:name w:val="Lined - Accent 4"/>
-    <w:basedOn w:val="11"/>
+    <w:basedOn w:val="705"/>
     <w:uiPriority w:val="99"/>
     <w:pPr>
       <w:pBdr/>
@@ -32020,9 +32071,9 @@
       </w:tcPr>
     </w:tblStylePr>
   </w:style>
-  <w:style w:type="table" w:styleId="122">
+  <w:style w:type="table" w:styleId="816">
     <w:name w:val="Lined - Accent 5"/>
-    <w:basedOn w:val="11"/>
+    <w:basedOn w:val="705"/>
     <w:uiPriority w:val="99"/>
     <w:pPr>
       <w:pBdr/>
@@ -32257,9 +32308,9 @@
       </w:tcPr>
     </w:tblStylePr>
   </w:style>
-  <w:style w:type="table" w:styleId="123">
+  <w:style w:type="table" w:styleId="817">
     <w:name w:val="Lined - Accent 6"/>
-    <w:basedOn w:val="11"/>
+    <w:basedOn w:val="705"/>
     <w:uiPriority w:val="99"/>
     <w:pPr>
       <w:pBdr/>
@@ -32494,9 +32545,9 @@
       </w:tcPr>
     </w:tblStylePr>
   </w:style>
-  <w:style w:type="table" w:styleId="124">
+  <w:style w:type="table" w:styleId="818">
     <w:name w:val="Bordered &amp; Lined - Accent"/>
-    <w:basedOn w:val="11"/>
+    <w:basedOn w:val="705"/>
     <w:uiPriority w:val="99"/>
     <w:pPr>
       <w:pBdr/>
@@ -32738,9 +32789,9 @@
       </w:tcPr>
     </w:tblStylePr>
   </w:style>
-  <w:style w:type="table" w:styleId="125">
+  <w:style w:type="table" w:styleId="819">
     <w:name w:val="Bordered &amp; Lined - Accent 1"/>
-    <w:basedOn w:val="11"/>
+    <w:basedOn w:val="705"/>
     <w:uiPriority w:val="99"/>
     <w:pPr>
       <w:pBdr/>
@@ -32982,9 +33033,9 @@
       </w:tcPr>
     </w:tblStylePr>
   </w:style>
-  <w:style w:type="table" w:styleId="126">
+  <w:style w:type="table" w:styleId="820">
     <w:name w:val="Bordered &amp; Lined - Accent 2"/>
-    <w:basedOn w:val="11"/>
+    <w:basedOn w:val="705"/>
     <w:uiPriority w:val="99"/>
     <w:pPr>
       <w:pBdr/>
@@ -33226,9 +33277,9 @@
       </w:tcPr>
     </w:tblStylePr>
   </w:style>
-  <w:style w:type="table" w:styleId="127">
+  <w:style w:type="table" w:styleId="821">
     <w:name w:val="Bordered &amp; Lined - Accent 3"/>
-    <w:basedOn w:val="11"/>
+    <w:basedOn w:val="705"/>
     <w:uiPriority w:val="99"/>
     <w:pPr>
       <w:pBdr/>
@@ -33470,9 +33521,9 @@
       </w:tcPr>
     </w:tblStylePr>
   </w:style>
-  <w:style w:type="table" w:styleId="128">
+  <w:style w:type="table" w:styleId="822">
     <w:name w:val="Bordered &amp; Lined - Accent 4"/>
-    <w:basedOn w:val="11"/>
+    <w:basedOn w:val="705"/>
     <w:uiPriority w:val="99"/>
     <w:pPr>
       <w:pBdr/>
@@ -33714,9 +33765,9 @@
       </w:tcPr>
     </w:tblStylePr>
   </w:style>
-  <w:style w:type="table" w:styleId="129">
+  <w:style w:type="table" w:styleId="823">
     <w:name w:val="Bordered &amp; Lined - Accent 5"/>
-    <w:basedOn w:val="11"/>
+    <w:basedOn w:val="705"/>
     <w:uiPriority w:val="99"/>
     <w:pPr>
       <w:pBdr/>
@@ -33958,9 +34009,9 @@
       </w:tcPr>
     </w:tblStylePr>
   </w:style>
-  <w:style w:type="table" w:styleId="130">
+  <w:style w:type="table" w:styleId="824">
     <w:name w:val="Bordered &amp; Lined - Accent 6"/>
-    <w:basedOn w:val="11"/>
+    <w:basedOn w:val="705"/>
     <w:uiPriority w:val="99"/>
     <w:pPr>
       <w:pBdr/>
@@ -34202,9 +34253,9 @@
       </w:tcPr>
     </w:tblStylePr>
   </w:style>
-  <w:style w:type="table" w:styleId="131">
+  <w:style w:type="table" w:styleId="825">
     <w:name w:val="Bordered"/>
-    <w:basedOn w:val="11"/>
+    <w:basedOn w:val="705"/>
     <w:uiPriority w:val="99"/>
     <w:pPr>
       <w:pBdr/>
@@ -34433,9 +34484,9 @@
       </w:tcPr>
     </w:tblStylePr>
   </w:style>
-  <w:style w:type="table" w:styleId="132">
+  <w:style w:type="table" w:styleId="826">
     <w:name w:val="Bordered - Accent 1"/>
-    <w:basedOn w:val="11"/>
+    <w:basedOn w:val="705"/>
     <w:uiPriority w:val="99"/>
     <w:pPr>
       <w:pBdr/>
@@ -34664,9 +34715,9 @@
       </w:tcPr>
     </w:tblStylePr>
   </w:style>
-  <w:style w:type="table" w:styleId="133">
+  <w:style w:type="table" w:styleId="827">
     <w:name w:val="Bordered - Accent 2"/>
-    <w:basedOn w:val="11"/>
+    <w:basedOn w:val="705"/>
     <w:uiPriority w:val="99"/>
     <w:pPr>
       <w:pBdr/>
@@ -34895,9 +34946,9 @@
       </w:tcPr>
     </w:tblStylePr>
   </w:style>
-  <w:style w:type="table" w:styleId="134">
+  <w:style w:type="table" w:styleId="828">
     <w:name w:val="Bordered - Accent 3"/>
-    <w:basedOn w:val="11"/>
+    <w:basedOn w:val="705"/>
     <w:uiPriority w:val="99"/>
     <w:pPr>
       <w:pBdr/>
@@ -35126,9 +35177,9 @@
       </w:tcPr>
     </w:tblStylePr>
   </w:style>
-  <w:style w:type="table" w:styleId="135">
+  <w:style w:type="table" w:styleId="829">
     <w:name w:val="Bordered - Accent 4"/>
-    <w:basedOn w:val="11"/>
+    <w:basedOn w:val="705"/>
     <w:uiPriority w:val="99"/>
     <w:pPr>
       <w:pBdr/>
@@ -35357,9 +35408,9 @@
       </w:tcPr>
     </w:tblStylePr>
   </w:style>
-  <w:style w:type="table" w:styleId="136">
+  <w:style w:type="table" w:styleId="830">
     <w:name w:val="Bordered - Accent 5"/>
-    <w:basedOn w:val="11"/>
+    <w:basedOn w:val="705"/>
     <w:uiPriority w:val="99"/>
     <w:pPr>
       <w:pBdr/>
@@ -35588,9 +35639,9 @@
       </w:tcPr>
     </w:tblStylePr>
   </w:style>
-  <w:style w:type="table" w:styleId="137">
+  <w:style w:type="table" w:styleId="831">
     <w:name w:val="Bordered - Accent 6"/>
-    <w:basedOn w:val="11"/>
+    <w:basedOn w:val="705"/>
     <w:uiPriority w:val="99"/>
     <w:pPr>
       <w:pBdr/>
@@ -35819,7 +35870,7 @@
       </w:tcPr>
     </w:tblStylePr>
   </w:style>
-  <w:style w:type="paragraph" w:styleId="138" w:default="1">
+  <w:style w:type="paragraph" w:styleId="832" w:default="1">
     <w:name w:val="Normal"/>
     <w:qFormat/>
     <w:pPr>
@@ -35828,11 +35879,11 @@
       <w:ind/>
     </w:pPr>
   </w:style>
-  <w:style w:type="paragraph" w:styleId="145">
+  <w:style w:type="paragraph" w:styleId="833">
     <w:name w:val="Heading 7"/>
-    <w:basedOn w:val="138"/>
-    <w:next w:val="138"/>
-    <w:link w:val="156"/>
+    <w:basedOn w:val="832"/>
+    <w:next w:val="832"/>
+    <w:link w:val="844"/>
     <w:uiPriority w:val="9"/>
     <w:unhideWhenUsed/>
     <w:qFormat/>
@@ -35849,11 +35900,11 @@
       <w:color w:val="595959" w:themeColor="text1" w:themeTint="A6"/>
     </w:rPr>
   </w:style>
-  <w:style w:type="paragraph" w:styleId="146">
+  <w:style w:type="paragraph" w:styleId="834">
     <w:name w:val="Heading 8"/>
-    <w:basedOn w:val="138"/>
-    <w:next w:val="138"/>
-    <w:link w:val="157"/>
+    <w:basedOn w:val="832"/>
+    <w:next w:val="832"/>
+    <w:link w:val="845"/>
     <w:uiPriority w:val="9"/>
     <w:unhideWhenUsed/>
     <w:qFormat/>
@@ -35872,11 +35923,11 @@
       <w:color w:val="272727" w:themeColor="text1" w:themeTint="D8"/>
     </w:rPr>
   </w:style>
-  <w:style w:type="paragraph" w:styleId="147">
+  <w:style w:type="paragraph" w:styleId="835">
     <w:name w:val="Heading 9"/>
-    <w:basedOn w:val="138"/>
-    <w:next w:val="138"/>
-    <w:link w:val="158"/>
+    <w:basedOn w:val="832"/>
+    <w:next w:val="832"/>
+    <w:link w:val="846"/>
     <w:uiPriority w:val="9"/>
     <w:unhideWhenUsed/>
     <w:qFormat/>
@@ -35895,7 +35946,7 @@
       <w:color w:val="272727" w:themeColor="text1" w:themeTint="D8"/>
     </w:rPr>
   </w:style>
-  <w:style w:type="character" w:styleId="148" w:default="1">
+  <w:style w:type="character" w:styleId="836" w:default="1">
     <w:name w:val="Default Paragraph Font"/>
     <w:uiPriority w:val="1"/>
     <w:semiHidden/>
@@ -35906,7 +35957,7 @@
       <w:ind/>
     </w:pPr>
   </w:style>
-  <w:style w:type="numbering" w:styleId="149" w:default="1">
+  <w:style w:type="numbering" w:styleId="837" w:default="1">
     <w:name w:val="No List"/>
     <w:uiPriority w:val="99"/>
     <w:semiHidden/>
@@ -35917,10 +35968,10 @@
       <w:ind/>
     </w:pPr>
   </w:style>
-  <w:style w:type="character" w:styleId="150">
+  <w:style w:type="character" w:styleId="838">
     <w:name w:val="Heading 1 Char"/>
-    <w:basedOn w:val="148"/>
-    <w:link w:val="723"/>
+    <w:basedOn w:val="836"/>
+    <w:link w:val="893"/>
     <w:uiPriority w:val="9"/>
     <w:pPr>
       <w:pBdr/>
@@ -35934,10 +35985,10 @@
       <w:szCs w:val="40"/>
     </w:rPr>
   </w:style>
-  <w:style w:type="character" w:styleId="151">
+  <w:style w:type="character" w:styleId="839">
     <w:name w:val="Heading 2 Char"/>
-    <w:basedOn w:val="148"/>
-    <w:link w:val="724"/>
+    <w:basedOn w:val="836"/>
+    <w:link w:val="894"/>
     <w:uiPriority w:val="9"/>
     <w:pPr>
       <w:pBdr/>
@@ -35951,10 +36002,10 @@
       <w:szCs w:val="32"/>
     </w:rPr>
   </w:style>
-  <w:style w:type="character" w:styleId="152">
+  <w:style w:type="character" w:styleId="840">
     <w:name w:val="Heading 3 Char"/>
-    <w:basedOn w:val="148"/>
-    <w:link w:val="710"/>
+    <w:basedOn w:val="836"/>
+    <w:link w:val="880"/>
     <w:uiPriority w:val="9"/>
     <w:pPr>
       <w:pBdr/>
@@ -35968,10 +36019,10 @@
       <w:szCs w:val="28"/>
     </w:rPr>
   </w:style>
-  <w:style w:type="character" w:styleId="153">
+  <w:style w:type="character" w:styleId="841">
     <w:name w:val="Heading 4 Char"/>
-    <w:basedOn w:val="148"/>
-    <w:link w:val="711"/>
+    <w:basedOn w:val="836"/>
+    <w:link w:val="881"/>
     <w:uiPriority w:val="9"/>
     <w:pPr>
       <w:pBdr/>
@@ -35985,10 +36036,10 @@
       <w:color w:val="0f4761" w:themeColor="accent1" w:themeShade="BF"/>
     </w:rPr>
   </w:style>
-  <w:style w:type="character" w:styleId="154">
+  <w:style w:type="character" w:styleId="842">
     <w:name w:val="Heading 5 Char"/>
-    <w:basedOn w:val="148"/>
-    <w:link w:val="712"/>
+    <w:basedOn w:val="836"/>
+    <w:link w:val="882"/>
     <w:uiPriority w:val="9"/>
     <w:pPr>
       <w:pBdr/>
@@ -36000,10 +36051,10 @@
       <w:color w:val="0f4761" w:themeColor="accent1" w:themeShade="BF"/>
     </w:rPr>
   </w:style>
-  <w:style w:type="character" w:styleId="155">
+  <w:style w:type="character" w:styleId="843">
     <w:name w:val="Heading 6 Char"/>
-    <w:basedOn w:val="148"/>
-    <w:link w:val="713"/>
+    <w:basedOn w:val="836"/>
+    <w:link w:val="883"/>
     <w:uiPriority w:val="9"/>
     <w:pPr>
       <w:pBdr/>
@@ -36017,10 +36068,10 @@
       <w:color w:val="595959" w:themeColor="text1" w:themeTint="A6"/>
     </w:rPr>
   </w:style>
-  <w:style w:type="character" w:styleId="156">
+  <w:style w:type="character" w:styleId="844">
     <w:name w:val="Heading 7 Char"/>
-    <w:basedOn w:val="148"/>
-    <w:link w:val="145"/>
+    <w:basedOn w:val="836"/>
+    <w:link w:val="833"/>
     <w:uiPriority w:val="9"/>
     <w:pPr>
       <w:pBdr/>
@@ -36032,10 +36083,10 @@
       <w:color w:val="595959" w:themeColor="text1" w:themeTint="A6"/>
     </w:rPr>
   </w:style>
-  <w:style w:type="character" w:styleId="157">
+  <w:style w:type="character" w:styleId="845">
     <w:name w:val="Heading 8 Char"/>
-    <w:basedOn w:val="148"/>
-    <w:link w:val="146"/>
+    <w:basedOn w:val="836"/>
+    <w:link w:val="834"/>
     <w:uiPriority w:val="9"/>
     <w:pPr>
       <w:pBdr/>
@@ -36049,10 +36100,10 @@
       <w:color w:val="272727" w:themeColor="text1" w:themeTint="D8"/>
     </w:rPr>
   </w:style>
-  <w:style w:type="character" w:styleId="158">
+  <w:style w:type="character" w:styleId="846">
     <w:name w:val="Heading 9 Char"/>
-    <w:basedOn w:val="148"/>
-    <w:link w:val="147"/>
+    <w:basedOn w:val="836"/>
+    <w:link w:val="835"/>
     <w:uiPriority w:val="9"/>
     <w:pPr>
       <w:pBdr/>
@@ -36066,10 +36117,10 @@
       <w:color w:val="272727" w:themeColor="text1" w:themeTint="D8"/>
     </w:rPr>
   </w:style>
-  <w:style w:type="character" w:styleId="160">
+  <w:style w:type="character" w:styleId="847">
     <w:name w:val="Title Char"/>
-    <w:basedOn w:val="148"/>
-    <w:link w:val="707"/>
+    <w:basedOn w:val="836"/>
+    <w:link w:val="879"/>
     <w:uiPriority w:val="10"/>
     <w:pPr>
       <w:pBdr/>
@@ -36083,11 +36134,11 @@
       <w:szCs w:val="56"/>
     </w:rPr>
   </w:style>
-  <w:style w:type="paragraph" w:styleId="161">
+  <w:style w:type="paragraph" w:styleId="848">
     <w:name w:val="Subtitle"/>
-    <w:basedOn w:val="138"/>
-    <w:next w:val="138"/>
-    <w:link w:val="162"/>
+    <w:basedOn w:val="832"/>
+    <w:next w:val="832"/>
+    <w:link w:val="849"/>
     <w:uiPriority w:val="11"/>
     <w:qFormat/>
     <w:pPr>
@@ -36105,10 +36156,10 @@
       <w:szCs w:val="28"/>
     </w:rPr>
   </w:style>
-  <w:style w:type="character" w:styleId="162">
+  <w:style w:type="character" w:styleId="849">
     <w:name w:val="Subtitle Char"/>
-    <w:basedOn w:val="148"/>
-    <w:link w:val="161"/>
+    <w:basedOn w:val="836"/>
+    <w:link w:val="848"/>
     <w:uiPriority w:val="11"/>
     <w:pPr>
       <w:pBdr/>
@@ -36122,11 +36173,11 @@
       <w:szCs w:val="28"/>
     </w:rPr>
   </w:style>
-  <w:style w:type="paragraph" w:styleId="163">
+  <w:style w:type="paragraph" w:styleId="850">
     <w:name w:val="Quote"/>
-    <w:basedOn w:val="138"/>
-    <w:next w:val="138"/>
-    <w:link w:val="164"/>
+    <w:basedOn w:val="832"/>
+    <w:next w:val="832"/>
+    <w:link w:val="851"/>
     <w:uiPriority w:val="29"/>
     <w:qFormat/>
     <w:pPr>
@@ -36141,10 +36192,10 @@
       <w:color w:val="404040" w:themeColor="text1" w:themeTint="BF"/>
     </w:rPr>
   </w:style>
-  <w:style w:type="character" w:styleId="164">
+  <w:style w:type="character" w:styleId="851">
     <w:name w:val="Quote Char"/>
-    <w:basedOn w:val="148"/>
-    <w:link w:val="163"/>
+    <w:basedOn w:val="836"/>
+    <w:link w:val="850"/>
     <w:uiPriority w:val="29"/>
     <w:pPr>
       <w:pBdr/>
@@ -36157,9 +36208,9 @@
       <w:color w:val="404040" w:themeColor="text1" w:themeTint="BF"/>
     </w:rPr>
   </w:style>
-  <w:style w:type="character" w:styleId="166">
+  <w:style w:type="character" w:styleId="852">
     <w:name w:val="Intense Emphasis"/>
-    <w:basedOn w:val="148"/>
+    <w:basedOn w:val="836"/>
     <w:uiPriority w:val="21"/>
     <w:qFormat/>
     <w:pPr>
@@ -36173,11 +36224,11 @@
       <w:color w:val="0f4761" w:themeColor="accent1" w:themeShade="BF"/>
     </w:rPr>
   </w:style>
-  <w:style w:type="paragraph" w:styleId="167">
+  <w:style w:type="paragraph" w:styleId="853">
     <w:name w:val="Intense Quote"/>
-    <w:basedOn w:val="138"/>
-    <w:next w:val="138"/>
-    <w:link w:val="168"/>
+    <w:basedOn w:val="832"/>
+    <w:next w:val="832"/>
+    <w:link w:val="854"/>
     <w:uiPriority w:val="30"/>
     <w:qFormat/>
     <w:pPr>
@@ -36195,10 +36246,10 @@
       <w:color w:val="0f4761" w:themeColor="accent1" w:themeShade="BF"/>
     </w:rPr>
   </w:style>
-  <w:style w:type="character" w:styleId="168">
+  <w:style w:type="character" w:styleId="854">
     <w:name w:val="Intense Quote Char"/>
-    <w:basedOn w:val="148"/>
-    <w:link w:val="167"/>
+    <w:basedOn w:val="836"/>
+    <w:link w:val="853"/>
     <w:uiPriority w:val="30"/>
     <w:pPr>
       <w:pBdr/>
@@ -36211,9 +36262,9 @@
       <w:color w:val="0f4761" w:themeColor="accent1" w:themeShade="BF"/>
     </w:rPr>
   </w:style>
-  <w:style w:type="character" w:styleId="169">
+  <w:style w:type="character" w:styleId="855">
     <w:name w:val="Intense Reference"/>
-    <w:basedOn w:val="148"/>
+    <w:basedOn w:val="836"/>
     <w:uiPriority w:val="32"/>
     <w:qFormat/>
     <w:pPr>
@@ -36229,9 +36280,9 @@
       <w:spacing w:val="5"/>
     </w:rPr>
   </w:style>
-  <w:style w:type="paragraph" w:styleId="170">
+  <w:style w:type="paragraph" w:styleId="856">
     <w:name w:val="No Spacing"/>
-    <w:basedOn w:val="138"/>
+    <w:basedOn w:val="832"/>
     <w:uiPriority w:val="1"/>
     <w:qFormat/>
     <w:pPr>
@@ -36240,9 +36291,9 @@
       <w:ind/>
     </w:pPr>
   </w:style>
-  <w:style w:type="character" w:styleId="171">
+  <w:style w:type="character" w:styleId="857">
     <w:name w:val="Subtle Emphasis"/>
-    <w:basedOn w:val="148"/>
+    <w:basedOn w:val="836"/>
     <w:uiPriority w:val="19"/>
     <w:qFormat/>
     <w:pPr>
@@ -36256,9 +36307,9 @@
       <w:color w:val="404040" w:themeColor="text1" w:themeTint="BF"/>
     </w:rPr>
   </w:style>
-  <w:style w:type="character" w:styleId="172">
+  <w:style w:type="character" w:styleId="858">
     <w:name w:val="Emphasis"/>
-    <w:basedOn w:val="148"/>
+    <w:basedOn w:val="836"/>
     <w:uiPriority w:val="20"/>
     <w:qFormat/>
     <w:pPr>
@@ -36271,9 +36322,9 @@
       <w:iCs/>
     </w:rPr>
   </w:style>
-  <w:style w:type="character" w:styleId="174">
+  <w:style w:type="character" w:styleId="859">
     <w:name w:val="Subtle Reference"/>
-    <w:basedOn w:val="148"/>
+    <w:basedOn w:val="836"/>
     <w:uiPriority w:val="31"/>
     <w:qFormat/>
     <w:pPr>
@@ -36286,9 +36337,9 @@
       <w:color w:val="5a5a5a" w:themeColor="text1" w:themeTint="A5"/>
     </w:rPr>
   </w:style>
-  <w:style w:type="character" w:styleId="175">
+  <w:style w:type="character" w:styleId="860">
     <w:name w:val="Book Title"/>
-    <w:basedOn w:val="148"/>
+    <w:basedOn w:val="836"/>
     <w:uiPriority w:val="33"/>
     <w:qFormat/>
     <w:pPr>
@@ -36304,10 +36355,10 @@
       <w:spacing w:val="5"/>
     </w:rPr>
   </w:style>
-  <w:style w:type="paragraph" w:styleId="176">
+  <w:style w:type="paragraph" w:styleId="861">
     <w:name w:val="Header"/>
-    <w:basedOn w:val="138"/>
-    <w:link w:val="177"/>
+    <w:basedOn w:val="832"/>
+    <w:link w:val="862"/>
     <w:uiPriority w:val="99"/>
     <w:unhideWhenUsed/>
     <w:pPr>
@@ -36320,10 +36371,10 @@
       <w:ind/>
     </w:pPr>
   </w:style>
-  <w:style w:type="character" w:styleId="177">
+  <w:style w:type="character" w:styleId="862">
     <w:name w:val="Header Char"/>
-    <w:basedOn w:val="148"/>
-    <w:link w:val="176"/>
+    <w:basedOn w:val="836"/>
+    <w:link w:val="861"/>
     <w:uiPriority w:val="99"/>
     <w:pPr>
       <w:pBdr/>
@@ -36331,10 +36382,10 @@
       <w:ind/>
     </w:pPr>
   </w:style>
-  <w:style w:type="paragraph" w:styleId="178">
+  <w:style w:type="paragraph" w:styleId="863">
     <w:name w:val="Footer"/>
-    <w:basedOn w:val="138"/>
-    <w:link w:val="179"/>
+    <w:basedOn w:val="832"/>
+    <w:link w:val="864"/>
     <w:uiPriority w:val="99"/>
     <w:unhideWhenUsed/>
     <w:pPr>
@@ -36347,10 +36398,10 @@
       <w:ind/>
     </w:pPr>
   </w:style>
-  <w:style w:type="character" w:styleId="179">
+  <w:style w:type="character" w:styleId="864">
     <w:name w:val="Footer Char"/>
-    <w:basedOn w:val="148"/>
-    <w:link w:val="178"/>
+    <w:basedOn w:val="836"/>
+    <w:link w:val="863"/>
     <w:uiPriority w:val="99"/>
     <w:pPr>
       <w:pBdr/>
@@ -36358,10 +36409,10 @@
       <w:ind/>
     </w:pPr>
   </w:style>
-  <w:style w:type="paragraph" w:styleId="180">
+  <w:style w:type="paragraph" w:styleId="865">
     <w:name w:val="Caption"/>
-    <w:basedOn w:val="138"/>
-    <w:next w:val="138"/>
+    <w:basedOn w:val="832"/>
+    <w:next w:val="832"/>
     <w:uiPriority w:val="35"/>
     <w:unhideWhenUsed/>
     <w:qFormat/>
@@ -36378,9 +36429,9 @@
       <w:szCs w:val="18"/>
     </w:rPr>
   </w:style>
-  <w:style w:type="character" w:styleId="188">
+  <w:style w:type="character" w:styleId="866">
     <w:name w:val="FollowedHyperlink"/>
-    <w:basedOn w:val="148"/>
+    <w:basedOn w:val="836"/>
     <w:uiPriority w:val="99"/>
     <w:semiHidden/>
     <w:unhideWhenUsed/>
@@ -36394,10 +36445,10 @@
       <w:u w:val="single"/>
     </w:rPr>
   </w:style>
-  <w:style w:type="paragraph" w:styleId="189">
+  <w:style w:type="paragraph" w:styleId="867">
     <w:name w:val="toc 1"/>
-    <w:basedOn w:val="138"/>
-    <w:next w:val="138"/>
+    <w:basedOn w:val="832"/>
+    <w:next w:val="832"/>
     <w:uiPriority w:val="39"/>
     <w:unhideWhenUsed/>
     <w:pPr>
@@ -36406,10 +36457,10 @@
       <w:ind/>
     </w:pPr>
   </w:style>
-  <w:style w:type="paragraph" w:styleId="190">
+  <w:style w:type="paragraph" w:styleId="868">
     <w:name w:val="toc 2"/>
-    <w:basedOn w:val="138"/>
-    <w:next w:val="138"/>
+    <w:basedOn w:val="832"/>
+    <w:next w:val="832"/>
     <w:uiPriority w:val="39"/>
     <w:unhideWhenUsed/>
     <w:pPr>
@@ -36418,10 +36469,10 @@
       <w:ind w:left="220"/>
     </w:pPr>
   </w:style>
-  <w:style w:type="paragraph" w:styleId="191">
+  <w:style w:type="paragraph" w:styleId="869">
     <w:name w:val="toc 3"/>
-    <w:basedOn w:val="138"/>
-    <w:next w:val="138"/>
+    <w:basedOn w:val="832"/>
+    <w:next w:val="832"/>
     <w:uiPriority w:val="39"/>
     <w:unhideWhenUsed/>
     <w:pPr>
@@ -36430,10 +36481,10 @@
       <w:ind w:left="440"/>
     </w:pPr>
   </w:style>
-  <w:style w:type="paragraph" w:styleId="192">
+  <w:style w:type="paragraph" w:styleId="870">
     <w:name w:val="toc 4"/>
-    <w:basedOn w:val="138"/>
-    <w:next w:val="138"/>
+    <w:basedOn w:val="832"/>
+    <w:next w:val="832"/>
     <w:uiPriority w:val="39"/>
     <w:unhideWhenUsed/>
     <w:pPr>
@@ -36442,10 +36493,10 @@
       <w:ind w:left="660"/>
     </w:pPr>
   </w:style>
-  <w:style w:type="paragraph" w:styleId="193">
+  <w:style w:type="paragraph" w:styleId="871">
     <w:name w:val="toc 5"/>
-    <w:basedOn w:val="138"/>
-    <w:next w:val="138"/>
+    <w:basedOn w:val="832"/>
+    <w:next w:val="832"/>
     <w:uiPriority w:val="39"/>
     <w:unhideWhenUsed/>
     <w:pPr>
@@ -36454,10 +36505,10 @@
       <w:ind w:left="880"/>
     </w:pPr>
   </w:style>
-  <w:style w:type="paragraph" w:styleId="194">
+  <w:style w:type="paragraph" w:styleId="872">
     <w:name w:val="toc 6"/>
-    <w:basedOn w:val="138"/>
-    <w:next w:val="138"/>
+    <w:basedOn w:val="832"/>
+    <w:next w:val="832"/>
     <w:uiPriority w:val="39"/>
     <w:unhideWhenUsed/>
     <w:pPr>
@@ -36466,10 +36517,10 @@
       <w:ind w:left="1100"/>
     </w:pPr>
   </w:style>
-  <w:style w:type="paragraph" w:styleId="195">
+  <w:style w:type="paragraph" w:styleId="873">
     <w:name w:val="toc 7"/>
-    <w:basedOn w:val="138"/>
-    <w:next w:val="138"/>
+    <w:basedOn w:val="832"/>
+    <w:next w:val="832"/>
     <w:uiPriority w:val="39"/>
     <w:unhideWhenUsed/>
     <w:pPr>
@@ -36478,10 +36529,10 @@
       <w:ind w:left="1320"/>
     </w:pPr>
   </w:style>
-  <w:style w:type="paragraph" w:styleId="196">
+  <w:style w:type="paragraph" w:styleId="874">
     <w:name w:val="toc 8"/>
-    <w:basedOn w:val="138"/>
-    <w:next w:val="138"/>
+    <w:basedOn w:val="832"/>
+    <w:next w:val="832"/>
     <w:uiPriority w:val="39"/>
     <w:unhideWhenUsed/>
     <w:pPr>
@@ -36490,10 +36541,10 @@
       <w:ind w:left="1540"/>
     </w:pPr>
   </w:style>
-  <w:style w:type="paragraph" w:styleId="197">
+  <w:style w:type="paragraph" w:styleId="875">
     <w:name w:val="toc 9"/>
-    <w:basedOn w:val="138"/>
-    <w:next w:val="138"/>
+    <w:basedOn w:val="832"/>
+    <w:next w:val="832"/>
     <w:uiPriority w:val="39"/>
     <w:unhideWhenUsed/>
     <w:pPr>
@@ -36502,9 +36553,9 @@
       <w:ind w:left="1760"/>
     </w:pPr>
   </w:style>
-  <w:style w:type="character" w:styleId="198">
+  <w:style w:type="character" w:styleId="876">
     <w:name w:val="Placeholder Text"/>
-    <w:basedOn w:val="148"/>
+    <w:basedOn w:val="836"/>
     <w:uiPriority w:val="99"/>
     <w:semiHidden/>
     <w:pPr>
@@ -36516,7 +36567,7 @@
       <w:color w:val="666666"/>
     </w:rPr>
   </w:style>
-  <w:style w:type="paragraph" w:styleId="208">
+  <w:style w:type="paragraph" w:styleId="877">
     <w:name w:val="TOC Heading"/>
     <w:uiPriority w:val="39"/>
     <w:unhideWhenUsed/>
@@ -36526,10 +36577,10 @@
       <w:ind/>
     </w:pPr>
   </w:style>
-  <w:style w:type="paragraph" w:styleId="209">
+  <w:style w:type="paragraph" w:styleId="878">
     <w:name w:val="table of figures"/>
-    <w:basedOn w:val="138"/>
-    <w:next w:val="138"/>
+    <w:basedOn w:val="832"/>
+    <w:next w:val="832"/>
     <w:uiPriority w:val="99"/>
     <w:unhideWhenUsed/>
     <w:pPr>
@@ -36538,7 +36589,7 @@
       <w:ind/>
     </w:pPr>
   </w:style>
-  <w:style w:type="paragraph" w:styleId="707">
+  <w:style w:type="paragraph" w:styleId="879">
     <w:name w:val="Title"/>
     <w:qFormat/>
     <w:pPr>
@@ -36551,7 +36602,7 @@
       <w:szCs w:val="56"/>
     </w:rPr>
   </w:style>
-  <w:style w:type="paragraph" w:styleId="710">
+  <w:style w:type="paragraph" w:styleId="880">
     <w:name w:val="Heading 3"/>
     <w:qFormat/>
     <w:pPr>
@@ -36565,7 +36616,7 @@
       <w:szCs w:val="24"/>
     </w:rPr>
   </w:style>
-  <w:style w:type="paragraph" w:styleId="711">
+  <w:style w:type="paragraph" w:styleId="881">
     <w:name w:val="Heading 4"/>
     <w:qFormat/>
     <w:pPr>
@@ -36579,7 +36630,7 @@
       <w:color w:val="2e74b5"/>
     </w:rPr>
   </w:style>
-  <w:style w:type="paragraph" w:styleId="712">
+  <w:style w:type="paragraph" w:styleId="882">
     <w:name w:val="Heading 5"/>
     <w:qFormat/>
     <w:pPr>
@@ -36591,7 +36642,7 @@
       <w:color w:val="2e74b5"/>
     </w:rPr>
   </w:style>
-  <w:style w:type="paragraph" w:styleId="713">
+  <w:style w:type="paragraph" w:styleId="883">
     <w:name w:val="Heading 6"/>
     <w:qFormat/>
     <w:pPr>
@@ -36603,7 +36654,7 @@
       <w:color w:val="1f4d78"/>
     </w:rPr>
   </w:style>
-  <w:style w:type="paragraph" w:styleId="714">
+  <w:style w:type="paragraph" w:styleId="884">
     <w:name w:val="Strong"/>
     <w:qFormat/>
     <w:pPr>
@@ -36616,7 +36667,7 @@
       <w:bCs/>
     </w:rPr>
   </w:style>
-  <w:style w:type="paragraph" w:styleId="715">
+  <w:style w:type="paragraph" w:styleId="885">
     <w:name w:val="List Paragraph"/>
     <w:qFormat/>
     <w:pPr>
@@ -36625,7 +36676,7 @@
       <w:ind/>
     </w:pPr>
   </w:style>
-  <w:style w:type="character" w:styleId="716">
+  <w:style w:type="character" w:styleId="886">
     <w:name w:val="Hyperlink"/>
     <w:uiPriority w:val="99"/>
     <w:unhideWhenUsed/>
@@ -36639,7 +36690,7 @@
       <w:u w:val="single"/>
     </w:rPr>
   </w:style>
-  <w:style w:type="character" w:styleId="717">
+  <w:style w:type="character" w:styleId="887">
     <w:name w:val="footnote reference"/>
     <w:uiPriority w:val="99"/>
     <w:semiHidden/>
@@ -36653,9 +36704,9 @@
       <w:vertAlign w:val="superscript"/>
     </w:rPr>
   </w:style>
-  <w:style w:type="paragraph" w:styleId="718">
+  <w:style w:type="paragraph" w:styleId="888">
     <w:name w:val="footnote text"/>
-    <w:link w:val="719"/>
+    <w:link w:val="889"/>
     <w:uiPriority w:val="99"/>
     <w:semiHidden/>
     <w:unhideWhenUsed/>
@@ -36669,9 +36720,9 @@
       <w:szCs w:val="20"/>
     </w:rPr>
   </w:style>
-  <w:style w:type="character" w:styleId="719">
+  <w:style w:type="character" w:styleId="889">
     <w:name w:val="Footnote Text Char"/>
-    <w:link w:val="718"/>
+    <w:link w:val="888"/>
     <w:uiPriority w:val="99"/>
     <w:semiHidden/>
     <w:unhideWhenUsed/>
@@ -36685,7 +36736,7 @@
       <w:szCs w:val="20"/>
     </w:rPr>
   </w:style>
-  <w:style w:type="character" w:styleId="720">
+  <w:style w:type="character" w:styleId="890">
     <w:name w:val="endnote reference"/>
     <w:uiPriority w:val="99"/>
     <w:semiHidden/>
@@ -36699,9 +36750,9 @@
       <w:vertAlign w:val="superscript"/>
     </w:rPr>
   </w:style>
-  <w:style w:type="paragraph" w:styleId="721">
+  <w:style w:type="paragraph" w:styleId="891">
     <w:name w:val="endnote text"/>
-    <w:link w:val="722"/>
+    <w:link w:val="892"/>
     <w:uiPriority w:val="99"/>
     <w:semiHidden/>
     <w:unhideWhenUsed/>
@@ -36715,9 +36766,9 @@
       <w:szCs w:val="20"/>
     </w:rPr>
   </w:style>
-  <w:style w:type="character" w:styleId="722">
+  <w:style w:type="character" w:styleId="892">
     <w:name w:val="Endnote Text Char"/>
-    <w:link w:val="721"/>
+    <w:link w:val="891"/>
     <w:uiPriority w:val="99"/>
     <w:semiHidden/>
     <w:unhideWhenUsed/>
@@ -36731,7 +36782,7 @@
       <w:szCs w:val="20"/>
     </w:rPr>
   </w:style>
-  <w:style w:type="paragraph" w:styleId="723">
+  <w:style w:type="paragraph" w:styleId="893">
     <w:name w:val="Heading 1"/>
     <w:qFormat/>
     <w:pPr>
@@ -36749,7 +36800,7 @@
       <w:szCs w:val="36"/>
     </w:rPr>
   </w:style>
-  <w:style w:type="paragraph" w:styleId="724">
+  <w:style w:type="paragraph" w:styleId="894">
     <w:name w:val="Heading 2"/>
     <w:qFormat/>
     <w:pPr>

</xml_diff>